<commit_message>
Finalize verified reports, four-member Notion handover and artifact checksums
</commit_message>
<xml_diff>
--- a/reports/BAO_CAO_DO_AN_GOEMOTIONS_IEEE.docx
+++ b/reports/BAO_CAO_DO_AN_GOEMOTIONS_IEEE.docx
@@ -311,7 +311,7 @@
         <w:pStyle w:val="Heading1"/>
         <w:pageBreakBefore w:val="0"/>
       </w:pPr>
-      <w:bookmarkStart w:id="0" w:name="_Toc242421747"/>
+      <w:bookmarkStart w:id="0" w:name="_Toc242423189"/>
       <w:r>
         <w:lastRenderedPageBreak/>
         <w:t>LỜI CẢM ƠN</w:t>
@@ -330,7 +330,7 @@
       <w:pPr>
         <w:pStyle w:val="Heading1"/>
       </w:pPr>
-      <w:bookmarkStart w:id="1" w:name="_Toc242421748"/>
+      <w:bookmarkStart w:id="1" w:name="_Toc242423190"/>
       <w:r>
         <w:lastRenderedPageBreak/>
         <w:t>TÓM TẮT</w:t>
@@ -377,7 +377,7 @@
       <w:pPr>
         <w:pStyle w:val="Heading1"/>
       </w:pPr>
-      <w:bookmarkStart w:id="2" w:name="_Toc242421749"/>
+      <w:bookmarkStart w:id="2" w:name="_Toc242423191"/>
       <w:r>
         <w:lastRenderedPageBreak/>
         <w:t>MỤC LỤC</w:t>
@@ -407,7 +407,7 @@
       <w:r>
         <w:fldChar w:fldCharType="separate"/>
       </w:r>
-      <w:hyperlink w:anchor="_Toc242421747" w:history="1">
+      <w:hyperlink w:anchor="_Toc242423189" w:history="1">
         <w:r>
           <w:rPr>
             <w:rStyle w:val="Hyperlink"/>
@@ -435,7 +435,7 @@
             <w:noProof/>
             <w:webHidden/>
           </w:rPr>
-          <w:instrText xml:space="preserve"> PAGEREF _Toc242421747 \h </w:instrText>
+          <w:instrText xml:space="preserve"> PAGEREF _Toc242423189 \h </w:instrText>
         </w:r>
         <w:r>
           <w:rPr>
@@ -480,7 +480,7 @@
           <w14:ligatures w14:val="standardContextual"/>
         </w:rPr>
       </w:pPr>
-      <w:hyperlink w:anchor="_Toc242421748" w:history="1">
+      <w:hyperlink w:anchor="_Toc242423190" w:history="1">
         <w:r>
           <w:rPr>
             <w:rStyle w:val="Hyperlink"/>
@@ -508,7 +508,7 @@
             <w:noProof/>
             <w:webHidden/>
           </w:rPr>
-          <w:instrText xml:space="preserve"> PAGEREF _Toc242421748 \h </w:instrText>
+          <w:instrText xml:space="preserve"> PAGEREF _Toc242423190 \h </w:instrText>
         </w:r>
         <w:r>
           <w:rPr>
@@ -553,7 +553,7 @@
           <w14:ligatures w14:val="standardContextual"/>
         </w:rPr>
       </w:pPr>
-      <w:hyperlink w:anchor="_Toc242421749" w:history="1">
+      <w:hyperlink w:anchor="_Toc242423191" w:history="1">
         <w:r>
           <w:rPr>
             <w:rStyle w:val="Hyperlink"/>
@@ -581,7 +581,7 @@
             <w:noProof/>
             <w:webHidden/>
           </w:rPr>
-          <w:instrText xml:space="preserve"> PAGEREF _Toc242421749 \h </w:instrText>
+          <w:instrText xml:space="preserve"> PAGEREF _Toc242423191 \h </w:instrText>
         </w:r>
         <w:r>
           <w:rPr>
@@ -626,7 +626,7 @@
           <w14:ligatures w14:val="standardContextual"/>
         </w:rPr>
       </w:pPr>
-      <w:hyperlink w:anchor="_Toc242421750" w:history="1">
+      <w:hyperlink w:anchor="_Toc242423192" w:history="1">
         <w:r>
           <w:rPr>
             <w:rStyle w:val="Hyperlink"/>
@@ -654,7 +654,7 @@
             <w:noProof/>
             <w:webHidden/>
           </w:rPr>
-          <w:instrText xml:space="preserve"> PAGEREF _Toc242421750 \h </w:instrText>
+          <w:instrText xml:space="preserve"> PAGEREF _Toc242423192 \h </w:instrText>
         </w:r>
         <w:r>
           <w:rPr>
@@ -699,7 +699,7 @@
           <w14:ligatures w14:val="standardContextual"/>
         </w:rPr>
       </w:pPr>
-      <w:hyperlink w:anchor="_Toc242421751" w:history="1">
+      <w:hyperlink w:anchor="_Toc242423193" w:history="1">
         <w:r>
           <w:rPr>
             <w:rStyle w:val="Hyperlink"/>
@@ -727,7 +727,7 @@
             <w:noProof/>
             <w:webHidden/>
           </w:rPr>
-          <w:instrText xml:space="preserve"> PAGEREF _Toc242421751 \h </w:instrText>
+          <w:instrText xml:space="preserve"> PAGEREF _Toc242423193 \h </w:instrText>
         </w:r>
         <w:r>
           <w:rPr>
@@ -772,7 +772,7 @@
           <w14:ligatures w14:val="standardContextual"/>
         </w:rPr>
       </w:pPr>
-      <w:hyperlink w:anchor="_Toc242421752" w:history="1">
+      <w:hyperlink w:anchor="_Toc242423194" w:history="1">
         <w:r>
           <w:rPr>
             <w:rStyle w:val="Hyperlink"/>
@@ -800,7 +800,7 @@
             <w:noProof/>
             <w:webHidden/>
           </w:rPr>
-          <w:instrText xml:space="preserve"> PAGEREF _Toc242421752 \h </w:instrText>
+          <w:instrText xml:space="preserve"> PAGEREF _Toc242423194 \h </w:instrText>
         </w:r>
         <w:r>
           <w:rPr>
@@ -845,7 +845,7 @@
           <w14:ligatures w14:val="standardContextual"/>
         </w:rPr>
       </w:pPr>
-      <w:hyperlink w:anchor="_Toc242421753" w:history="1">
+      <w:hyperlink w:anchor="_Toc242423195" w:history="1">
         <w:r>
           <w:rPr>
             <w:rStyle w:val="Hyperlink"/>
@@ -873,7 +873,7 @@
             <w:noProof/>
             <w:webHidden/>
           </w:rPr>
-          <w:instrText xml:space="preserve"> PAGEREF _Toc242421753 \h </w:instrText>
+          <w:instrText xml:space="preserve"> PAGEREF _Toc242423195 \h </w:instrText>
         </w:r>
         <w:r>
           <w:rPr>
@@ -918,7 +918,7 @@
           <w14:ligatures w14:val="standardContextual"/>
         </w:rPr>
       </w:pPr>
-      <w:hyperlink w:anchor="_Toc242421754" w:history="1">
+      <w:hyperlink w:anchor="_Toc242423196" w:history="1">
         <w:r>
           <w:rPr>
             <w:rStyle w:val="Hyperlink"/>
@@ -946,7 +946,7 @@
             <w:noProof/>
             <w:webHidden/>
           </w:rPr>
-          <w:instrText xml:space="preserve"> PAGEREF _Toc242421754 \h </w:instrText>
+          <w:instrText xml:space="preserve"> PAGEREF _Toc242423196 \h </w:instrText>
         </w:r>
         <w:r>
           <w:rPr>
@@ -991,7 +991,7 @@
           <w14:ligatures w14:val="standardContextual"/>
         </w:rPr>
       </w:pPr>
-      <w:hyperlink w:anchor="_Toc242421755" w:history="1">
+      <w:hyperlink w:anchor="_Toc242423197" w:history="1">
         <w:r>
           <w:rPr>
             <w:rStyle w:val="Hyperlink"/>
@@ -1019,7 +1019,7 @@
             <w:noProof/>
             <w:webHidden/>
           </w:rPr>
-          <w:instrText xml:space="preserve"> PAGEREF _Toc242421755 \h </w:instrText>
+          <w:instrText xml:space="preserve"> PAGEREF _Toc242423197 \h </w:instrText>
         </w:r>
         <w:r>
           <w:rPr>
@@ -1064,7 +1064,7 @@
           <w14:ligatures w14:val="standardContextual"/>
         </w:rPr>
       </w:pPr>
-      <w:hyperlink w:anchor="_Toc242421756" w:history="1">
+      <w:hyperlink w:anchor="_Toc242423198" w:history="1">
         <w:r>
           <w:rPr>
             <w:rStyle w:val="Hyperlink"/>
@@ -1092,7 +1092,7 @@
             <w:noProof/>
             <w:webHidden/>
           </w:rPr>
-          <w:instrText xml:space="preserve"> PAGEREF _Toc242421756 \h </w:instrText>
+          <w:instrText xml:space="preserve"> PAGEREF _Toc242423198 \h </w:instrText>
         </w:r>
         <w:r>
           <w:rPr>
@@ -1137,7 +1137,7 @@
           <w14:ligatures w14:val="standardContextual"/>
         </w:rPr>
       </w:pPr>
-      <w:hyperlink w:anchor="_Toc242421757" w:history="1">
+      <w:hyperlink w:anchor="_Toc242423199" w:history="1">
         <w:r>
           <w:rPr>
             <w:rStyle w:val="Hyperlink"/>
@@ -1165,7 +1165,7 @@
             <w:noProof/>
             <w:webHidden/>
           </w:rPr>
-          <w:instrText xml:space="preserve"> PAGEREF _Toc242421757 \h </w:instrText>
+          <w:instrText xml:space="preserve"> PAGEREF _Toc242423199 \h </w:instrText>
         </w:r>
         <w:r>
           <w:rPr>
@@ -1210,7 +1210,7 @@
           <w14:ligatures w14:val="standardContextual"/>
         </w:rPr>
       </w:pPr>
-      <w:hyperlink w:anchor="_Toc242421758" w:history="1">
+      <w:hyperlink w:anchor="_Toc242423200" w:history="1">
         <w:r>
           <w:rPr>
             <w:rStyle w:val="Hyperlink"/>
@@ -1238,7 +1238,7 @@
             <w:noProof/>
             <w:webHidden/>
           </w:rPr>
-          <w:instrText xml:space="preserve"> PAGEREF _Toc242421758 \h </w:instrText>
+          <w:instrText xml:space="preserve"> PAGEREF _Toc242423200 \h </w:instrText>
         </w:r>
         <w:r>
           <w:rPr>
@@ -1283,7 +1283,7 @@
           <w14:ligatures w14:val="standardContextual"/>
         </w:rPr>
       </w:pPr>
-      <w:hyperlink w:anchor="_Toc242421759" w:history="1">
+      <w:hyperlink w:anchor="_Toc242423201" w:history="1">
         <w:r>
           <w:rPr>
             <w:rStyle w:val="Hyperlink"/>
@@ -1311,7 +1311,7 @@
             <w:noProof/>
             <w:webHidden/>
           </w:rPr>
-          <w:instrText xml:space="preserve"> PAGEREF _Toc242421759 \h </w:instrText>
+          <w:instrText xml:space="preserve"> PAGEREF _Toc242423201 \h </w:instrText>
         </w:r>
         <w:r>
           <w:rPr>
@@ -1356,7 +1356,7 @@
           <w14:ligatures w14:val="standardContextual"/>
         </w:rPr>
       </w:pPr>
-      <w:hyperlink w:anchor="_Toc242421760" w:history="1">
+      <w:hyperlink w:anchor="_Toc242423202" w:history="1">
         <w:r>
           <w:rPr>
             <w:rStyle w:val="Hyperlink"/>
@@ -1384,7 +1384,7 @@
             <w:noProof/>
             <w:webHidden/>
           </w:rPr>
-          <w:instrText xml:space="preserve"> PAGEREF _Toc242421760 \h </w:instrText>
+          <w:instrText xml:space="preserve"> PAGEREF _Toc242423202 \h </w:instrText>
         </w:r>
         <w:r>
           <w:rPr>
@@ -1429,7 +1429,7 @@
           <w14:ligatures w14:val="standardContextual"/>
         </w:rPr>
       </w:pPr>
-      <w:hyperlink w:anchor="_Toc242421761" w:history="1">
+      <w:hyperlink w:anchor="_Toc242423203" w:history="1">
         <w:r>
           <w:rPr>
             <w:rStyle w:val="Hyperlink"/>
@@ -1457,7 +1457,7 @@
             <w:noProof/>
             <w:webHidden/>
           </w:rPr>
-          <w:instrText xml:space="preserve"> PAGEREF _Toc242421761 \h </w:instrText>
+          <w:instrText xml:space="preserve"> PAGEREF _Toc242423203 \h </w:instrText>
         </w:r>
         <w:r>
           <w:rPr>
@@ -1502,7 +1502,7 @@
           <w14:ligatures w14:val="standardContextual"/>
         </w:rPr>
       </w:pPr>
-      <w:hyperlink w:anchor="_Toc242421762" w:history="1">
+      <w:hyperlink w:anchor="_Toc242423204" w:history="1">
         <w:r>
           <w:rPr>
             <w:rStyle w:val="Hyperlink"/>
@@ -1530,7 +1530,7 @@
             <w:noProof/>
             <w:webHidden/>
           </w:rPr>
-          <w:instrText xml:space="preserve"> PAGEREF _Toc242421762 \h </w:instrText>
+          <w:instrText xml:space="preserve"> PAGEREF _Toc242423204 \h </w:instrText>
         </w:r>
         <w:r>
           <w:rPr>
@@ -1575,7 +1575,7 @@
           <w14:ligatures w14:val="standardContextual"/>
         </w:rPr>
       </w:pPr>
-      <w:hyperlink w:anchor="_Toc242421763" w:history="1">
+      <w:hyperlink w:anchor="_Toc242423205" w:history="1">
         <w:r>
           <w:rPr>
             <w:rStyle w:val="Hyperlink"/>
@@ -1603,7 +1603,7 @@
             <w:noProof/>
             <w:webHidden/>
           </w:rPr>
-          <w:instrText xml:space="preserve"> PAGEREF _Toc242421763 \h </w:instrText>
+          <w:instrText xml:space="preserve"> PAGEREF _Toc242423205 \h </w:instrText>
         </w:r>
         <w:r>
           <w:rPr>
@@ -1648,7 +1648,7 @@
           <w14:ligatures w14:val="standardContextual"/>
         </w:rPr>
       </w:pPr>
-      <w:hyperlink w:anchor="_Toc242421764" w:history="1">
+      <w:hyperlink w:anchor="_Toc242423206" w:history="1">
         <w:r>
           <w:rPr>
             <w:rStyle w:val="Hyperlink"/>
@@ -1676,7 +1676,7 @@
             <w:noProof/>
             <w:webHidden/>
           </w:rPr>
-          <w:instrText xml:space="preserve"> PAGEREF _Toc242421764 \h </w:instrText>
+          <w:instrText xml:space="preserve"> PAGEREF _Toc242423206 \h </w:instrText>
         </w:r>
         <w:r>
           <w:rPr>
@@ -1721,7 +1721,7 @@
           <w14:ligatures w14:val="standardContextual"/>
         </w:rPr>
       </w:pPr>
-      <w:hyperlink w:anchor="_Toc242421765" w:history="1">
+      <w:hyperlink w:anchor="_Toc242423207" w:history="1">
         <w:r>
           <w:rPr>
             <w:rStyle w:val="Hyperlink"/>
@@ -1749,7 +1749,7 @@
             <w:noProof/>
             <w:webHidden/>
           </w:rPr>
-          <w:instrText xml:space="preserve"> PAGEREF _Toc242421765 \h </w:instrText>
+          <w:instrText xml:space="preserve"> PAGEREF _Toc242423207 \h </w:instrText>
         </w:r>
         <w:r>
           <w:rPr>
@@ -1794,7 +1794,7 @@
           <w14:ligatures w14:val="standardContextual"/>
         </w:rPr>
       </w:pPr>
-      <w:hyperlink w:anchor="_Toc242421766" w:history="1">
+      <w:hyperlink w:anchor="_Toc242423208" w:history="1">
         <w:r>
           <w:rPr>
             <w:rStyle w:val="Hyperlink"/>
@@ -1822,7 +1822,7 @@
             <w:noProof/>
             <w:webHidden/>
           </w:rPr>
-          <w:instrText xml:space="preserve"> PAGEREF _Toc242421766 \h </w:instrText>
+          <w:instrText xml:space="preserve"> PAGEREF _Toc242423208 \h </w:instrText>
         </w:r>
         <w:r>
           <w:rPr>
@@ -1867,7 +1867,7 @@
           <w14:ligatures w14:val="standardContextual"/>
         </w:rPr>
       </w:pPr>
-      <w:hyperlink w:anchor="_Toc242421767" w:history="1">
+      <w:hyperlink w:anchor="_Toc242423209" w:history="1">
         <w:r>
           <w:rPr>
             <w:rStyle w:val="Hyperlink"/>
@@ -1895,7 +1895,7 @@
             <w:noProof/>
             <w:webHidden/>
           </w:rPr>
-          <w:instrText xml:space="preserve"> PAGEREF _Toc242421767 \h </w:instrText>
+          <w:instrText xml:space="preserve"> PAGEREF _Toc242423209 \h </w:instrText>
         </w:r>
         <w:r>
           <w:rPr>
@@ -1940,7 +1940,7 @@
           <w14:ligatures w14:val="standardContextual"/>
         </w:rPr>
       </w:pPr>
-      <w:hyperlink w:anchor="_Toc242421768" w:history="1">
+      <w:hyperlink w:anchor="_Toc242423210" w:history="1">
         <w:r>
           <w:rPr>
             <w:rStyle w:val="Hyperlink"/>
@@ -1968,7 +1968,7 @@
             <w:noProof/>
             <w:webHidden/>
           </w:rPr>
-          <w:instrText xml:space="preserve"> PAGEREF _Toc242421768 \h </w:instrText>
+          <w:instrText xml:space="preserve"> PAGEREF _Toc242423210 \h </w:instrText>
         </w:r>
         <w:r>
           <w:rPr>
@@ -2013,7 +2013,7 @@
           <w14:ligatures w14:val="standardContextual"/>
         </w:rPr>
       </w:pPr>
-      <w:hyperlink w:anchor="_Toc242421769" w:history="1">
+      <w:hyperlink w:anchor="_Toc242423211" w:history="1">
         <w:r>
           <w:rPr>
             <w:rStyle w:val="Hyperlink"/>
@@ -2041,7 +2041,7 @@
             <w:noProof/>
             <w:webHidden/>
           </w:rPr>
-          <w:instrText xml:space="preserve"> PAGEREF _Toc242421769 \h </w:instrText>
+          <w:instrText xml:space="preserve"> PAGEREF _Toc242423211 \h </w:instrText>
         </w:r>
         <w:r>
           <w:rPr>
@@ -2086,7 +2086,7 @@
           <w14:ligatures w14:val="standardContextual"/>
         </w:rPr>
       </w:pPr>
-      <w:hyperlink w:anchor="_Toc242421770" w:history="1">
+      <w:hyperlink w:anchor="_Toc242423212" w:history="1">
         <w:r>
           <w:rPr>
             <w:rStyle w:val="Hyperlink"/>
@@ -2114,7 +2114,7 @@
             <w:noProof/>
             <w:webHidden/>
           </w:rPr>
-          <w:instrText xml:space="preserve"> PAGEREF _Toc242421770 \h </w:instrText>
+          <w:instrText xml:space="preserve"> PAGEREF _Toc242423212 \h </w:instrText>
         </w:r>
         <w:r>
           <w:rPr>
@@ -2159,7 +2159,7 @@
           <w14:ligatures w14:val="standardContextual"/>
         </w:rPr>
       </w:pPr>
-      <w:hyperlink w:anchor="_Toc242421771" w:history="1">
+      <w:hyperlink w:anchor="_Toc242423213" w:history="1">
         <w:r>
           <w:rPr>
             <w:rStyle w:val="Hyperlink"/>
@@ -2187,7 +2187,7 @@
             <w:noProof/>
             <w:webHidden/>
           </w:rPr>
-          <w:instrText xml:space="preserve"> PAGEREF _Toc242421771 \h </w:instrText>
+          <w:instrText xml:space="preserve"> PAGEREF _Toc242423213 \h </w:instrText>
         </w:r>
         <w:r>
           <w:rPr>
@@ -2232,7 +2232,7 @@
           <w14:ligatures w14:val="standardContextual"/>
         </w:rPr>
       </w:pPr>
-      <w:hyperlink w:anchor="_Toc242421772" w:history="1">
+      <w:hyperlink w:anchor="_Toc242423214" w:history="1">
         <w:r>
           <w:rPr>
             <w:rStyle w:val="Hyperlink"/>
@@ -2260,7 +2260,7 @@
             <w:noProof/>
             <w:webHidden/>
           </w:rPr>
-          <w:instrText xml:space="preserve"> PAGEREF _Toc242421772 \h </w:instrText>
+          <w:instrText xml:space="preserve"> PAGEREF _Toc242423214 \h </w:instrText>
         </w:r>
         <w:r>
           <w:rPr>
@@ -2305,7 +2305,7 @@
           <w14:ligatures w14:val="standardContextual"/>
         </w:rPr>
       </w:pPr>
-      <w:hyperlink w:anchor="_Toc242421773" w:history="1">
+      <w:hyperlink w:anchor="_Toc242423215" w:history="1">
         <w:r>
           <w:rPr>
             <w:rStyle w:val="Hyperlink"/>
@@ -2333,7 +2333,7 @@
             <w:noProof/>
             <w:webHidden/>
           </w:rPr>
-          <w:instrText xml:space="preserve"> PAGEREF _Toc242421773 \h </w:instrText>
+          <w:instrText xml:space="preserve"> PAGEREF _Toc242423215 \h </w:instrText>
         </w:r>
         <w:r>
           <w:rPr>
@@ -2378,7 +2378,7 @@
           <w14:ligatures w14:val="standardContextual"/>
         </w:rPr>
       </w:pPr>
-      <w:hyperlink w:anchor="_Toc242421774" w:history="1">
+      <w:hyperlink w:anchor="_Toc242423216" w:history="1">
         <w:r>
           <w:rPr>
             <w:rStyle w:val="Hyperlink"/>
@@ -2406,7 +2406,7 @@
             <w:noProof/>
             <w:webHidden/>
           </w:rPr>
-          <w:instrText xml:space="preserve"> PAGEREF _Toc242421774 \h </w:instrText>
+          <w:instrText xml:space="preserve"> PAGEREF _Toc242423216 \h </w:instrText>
         </w:r>
         <w:r>
           <w:rPr>
@@ -2451,7 +2451,7 @@
           <w14:ligatures w14:val="standardContextual"/>
         </w:rPr>
       </w:pPr>
-      <w:hyperlink w:anchor="_Toc242421775" w:history="1">
+      <w:hyperlink w:anchor="_Toc242423217" w:history="1">
         <w:r>
           <w:rPr>
             <w:rStyle w:val="Hyperlink"/>
@@ -2479,7 +2479,7 @@
             <w:noProof/>
             <w:webHidden/>
           </w:rPr>
-          <w:instrText xml:space="preserve"> PAGEREF _Toc242421775 \h </w:instrText>
+          <w:instrText xml:space="preserve"> PAGEREF _Toc242423217 \h </w:instrText>
         </w:r>
         <w:r>
           <w:rPr>
@@ -2524,7 +2524,7 @@
           <w14:ligatures w14:val="standardContextual"/>
         </w:rPr>
       </w:pPr>
-      <w:hyperlink w:anchor="_Toc242421776" w:history="1">
+      <w:hyperlink w:anchor="_Toc242423218" w:history="1">
         <w:r>
           <w:rPr>
             <w:rStyle w:val="Hyperlink"/>
@@ -2552,7 +2552,7 @@
             <w:noProof/>
             <w:webHidden/>
           </w:rPr>
-          <w:instrText xml:space="preserve"> PAGEREF _Toc242421776 \h </w:instrText>
+          <w:instrText xml:space="preserve"> PAGEREF _Toc242423218 \h </w:instrText>
         </w:r>
         <w:r>
           <w:rPr>
@@ -2597,7 +2597,7 @@
           <w14:ligatures w14:val="standardContextual"/>
         </w:rPr>
       </w:pPr>
-      <w:hyperlink w:anchor="_Toc242421777" w:history="1">
+      <w:hyperlink w:anchor="_Toc242423219" w:history="1">
         <w:r>
           <w:rPr>
             <w:rStyle w:val="Hyperlink"/>
@@ -2625,7 +2625,7 @@
             <w:noProof/>
             <w:webHidden/>
           </w:rPr>
-          <w:instrText xml:space="preserve"> PAGEREF _Toc242421777 \h </w:instrText>
+          <w:instrText xml:space="preserve"> PAGEREF _Toc242423219 \h </w:instrText>
         </w:r>
         <w:r>
           <w:rPr>
@@ -2670,7 +2670,7 @@
           <w14:ligatures w14:val="standardContextual"/>
         </w:rPr>
       </w:pPr>
-      <w:hyperlink w:anchor="_Toc242421778" w:history="1">
+      <w:hyperlink w:anchor="_Toc242423220" w:history="1">
         <w:r>
           <w:rPr>
             <w:rStyle w:val="Hyperlink"/>
@@ -2698,7 +2698,7 @@
             <w:noProof/>
             <w:webHidden/>
           </w:rPr>
-          <w:instrText xml:space="preserve"> PAGEREF _Toc242421778 \h </w:instrText>
+          <w:instrText xml:space="preserve"> PAGEREF _Toc242423220 \h </w:instrText>
         </w:r>
         <w:r>
           <w:rPr>
@@ -2743,7 +2743,7 @@
           <w14:ligatures w14:val="standardContextual"/>
         </w:rPr>
       </w:pPr>
-      <w:hyperlink w:anchor="_Toc242421779" w:history="1">
+      <w:hyperlink w:anchor="_Toc242423221" w:history="1">
         <w:r>
           <w:rPr>
             <w:rStyle w:val="Hyperlink"/>
@@ -2771,7 +2771,7 @@
             <w:noProof/>
             <w:webHidden/>
           </w:rPr>
-          <w:instrText xml:space="preserve"> PAGEREF _Toc242421779 \h </w:instrText>
+          <w:instrText xml:space="preserve"> PAGEREF _Toc242423221 \h </w:instrText>
         </w:r>
         <w:r>
           <w:rPr>
@@ -2816,7 +2816,7 @@
           <w14:ligatures w14:val="standardContextual"/>
         </w:rPr>
       </w:pPr>
-      <w:hyperlink w:anchor="_Toc242421780" w:history="1">
+      <w:hyperlink w:anchor="_Toc242423222" w:history="1">
         <w:r>
           <w:rPr>
             <w:rStyle w:val="Hyperlink"/>
@@ -2844,7 +2844,7 @@
             <w:noProof/>
             <w:webHidden/>
           </w:rPr>
-          <w:instrText xml:space="preserve"> PAGEREF _Toc242421780 \h </w:instrText>
+          <w:instrText xml:space="preserve"> PAGEREF _Toc242423222 \h </w:instrText>
         </w:r>
         <w:r>
           <w:rPr>
@@ -2889,7 +2889,7 @@
           <w14:ligatures w14:val="standardContextual"/>
         </w:rPr>
       </w:pPr>
-      <w:hyperlink w:anchor="_Toc242421781" w:history="1">
+      <w:hyperlink w:anchor="_Toc242423223" w:history="1">
         <w:r>
           <w:rPr>
             <w:rStyle w:val="Hyperlink"/>
@@ -2917,7 +2917,7 @@
             <w:noProof/>
             <w:webHidden/>
           </w:rPr>
-          <w:instrText xml:space="preserve"> PAGEREF _Toc242421781 \h </w:instrText>
+          <w:instrText xml:space="preserve"> PAGEREF _Toc242423223 \h </w:instrText>
         </w:r>
         <w:r>
           <w:rPr>
@@ -2962,7 +2962,7 @@
           <w14:ligatures w14:val="standardContextual"/>
         </w:rPr>
       </w:pPr>
-      <w:hyperlink w:anchor="_Toc242421782" w:history="1">
+      <w:hyperlink w:anchor="_Toc242423224" w:history="1">
         <w:r>
           <w:rPr>
             <w:rStyle w:val="Hyperlink"/>
@@ -2990,7 +2990,7 @@
             <w:noProof/>
             <w:webHidden/>
           </w:rPr>
-          <w:instrText xml:space="preserve"> PAGEREF _Toc242421782 \h </w:instrText>
+          <w:instrText xml:space="preserve"> PAGEREF _Toc242423224 \h </w:instrText>
         </w:r>
         <w:r>
           <w:rPr>
@@ -3035,7 +3035,7 @@
           <w14:ligatures w14:val="standardContextual"/>
         </w:rPr>
       </w:pPr>
-      <w:hyperlink w:anchor="_Toc242421783" w:history="1">
+      <w:hyperlink w:anchor="_Toc242423225" w:history="1">
         <w:r>
           <w:rPr>
             <w:rStyle w:val="Hyperlink"/>
@@ -3063,7 +3063,7 @@
             <w:noProof/>
             <w:webHidden/>
           </w:rPr>
-          <w:instrText xml:space="preserve"> PAGEREF _Toc242421783 \h </w:instrText>
+          <w:instrText xml:space="preserve"> PAGEREF _Toc242423225 \h </w:instrText>
         </w:r>
         <w:r>
           <w:rPr>
@@ -3108,7 +3108,7 @@
           <w14:ligatures w14:val="standardContextual"/>
         </w:rPr>
       </w:pPr>
-      <w:hyperlink w:anchor="_Toc242421784" w:history="1">
+      <w:hyperlink w:anchor="_Toc242423226" w:history="1">
         <w:r>
           <w:rPr>
             <w:rStyle w:val="Hyperlink"/>
@@ -3136,7 +3136,7 @@
             <w:noProof/>
             <w:webHidden/>
           </w:rPr>
-          <w:instrText xml:space="preserve"> PAGEREF _Toc242421784 \h </w:instrText>
+          <w:instrText xml:space="preserve"> PAGEREF _Toc242423226 \h </w:instrText>
         </w:r>
         <w:r>
           <w:rPr>
@@ -3181,7 +3181,7 @@
           <w14:ligatures w14:val="standardContextual"/>
         </w:rPr>
       </w:pPr>
-      <w:hyperlink w:anchor="_Toc242421785" w:history="1">
+      <w:hyperlink w:anchor="_Toc242423227" w:history="1">
         <w:r>
           <w:rPr>
             <w:rStyle w:val="Hyperlink"/>
@@ -3209,7 +3209,7 @@
             <w:noProof/>
             <w:webHidden/>
           </w:rPr>
-          <w:instrText xml:space="preserve"> PAGEREF _Toc242421785 \h </w:instrText>
+          <w:instrText xml:space="preserve"> PAGEREF _Toc242423227 \h </w:instrText>
         </w:r>
         <w:r>
           <w:rPr>
@@ -3254,7 +3254,7 @@
           <w14:ligatures w14:val="standardContextual"/>
         </w:rPr>
       </w:pPr>
-      <w:hyperlink w:anchor="_Toc242421786" w:history="1">
+      <w:hyperlink w:anchor="_Toc242423228" w:history="1">
         <w:r>
           <w:rPr>
             <w:rStyle w:val="Hyperlink"/>
@@ -3282,7 +3282,7 @@
             <w:noProof/>
             <w:webHidden/>
           </w:rPr>
-          <w:instrText xml:space="preserve"> PAGEREF _Toc242421786 \h </w:instrText>
+          <w:instrText xml:space="preserve"> PAGEREF _Toc242423228 \h </w:instrText>
         </w:r>
         <w:r>
           <w:rPr>
@@ -3327,7 +3327,7 @@
           <w14:ligatures w14:val="standardContextual"/>
         </w:rPr>
       </w:pPr>
-      <w:hyperlink w:anchor="_Toc242421787" w:history="1">
+      <w:hyperlink w:anchor="_Toc242423229" w:history="1">
         <w:r>
           <w:rPr>
             <w:rStyle w:val="Hyperlink"/>
@@ -3355,7 +3355,7 @@
             <w:noProof/>
             <w:webHidden/>
           </w:rPr>
-          <w:instrText xml:space="preserve"> PAGEREF _Toc242421787 \h </w:instrText>
+          <w:instrText xml:space="preserve"> PAGEREF _Toc242423229 \h </w:instrText>
         </w:r>
         <w:r>
           <w:rPr>
@@ -3400,7 +3400,7 @@
           <w14:ligatures w14:val="standardContextual"/>
         </w:rPr>
       </w:pPr>
-      <w:hyperlink w:anchor="_Toc242421788" w:history="1">
+      <w:hyperlink w:anchor="_Toc242423230" w:history="1">
         <w:r>
           <w:rPr>
             <w:rStyle w:val="Hyperlink"/>
@@ -3428,7 +3428,7 @@
             <w:noProof/>
             <w:webHidden/>
           </w:rPr>
-          <w:instrText xml:space="preserve"> PAGEREF _Toc242421788 \h </w:instrText>
+          <w:instrText xml:space="preserve"> PAGEREF _Toc242423230 \h </w:instrText>
         </w:r>
         <w:r>
           <w:rPr>
@@ -3473,7 +3473,7 @@
           <w14:ligatures w14:val="standardContextual"/>
         </w:rPr>
       </w:pPr>
-      <w:hyperlink w:anchor="_Toc242421789" w:history="1">
+      <w:hyperlink w:anchor="_Toc242423231" w:history="1">
         <w:r>
           <w:rPr>
             <w:rStyle w:val="Hyperlink"/>
@@ -3501,7 +3501,7 @@
             <w:noProof/>
             <w:webHidden/>
           </w:rPr>
-          <w:instrText xml:space="preserve"> PAGEREF _Toc242421789 \h </w:instrText>
+          <w:instrText xml:space="preserve"> PAGEREF _Toc242423231 \h </w:instrText>
         </w:r>
         <w:r>
           <w:rPr>
@@ -3546,7 +3546,7 @@
           <w14:ligatures w14:val="standardContextual"/>
         </w:rPr>
       </w:pPr>
-      <w:hyperlink w:anchor="_Toc242421790" w:history="1">
+      <w:hyperlink w:anchor="_Toc242423232" w:history="1">
         <w:r>
           <w:rPr>
             <w:rStyle w:val="Hyperlink"/>
@@ -3574,7 +3574,7 @@
             <w:noProof/>
             <w:webHidden/>
           </w:rPr>
-          <w:instrText xml:space="preserve"> PAGEREF _Toc242421790 \h </w:instrText>
+          <w:instrText xml:space="preserve"> PAGEREF _Toc242423232 \h </w:instrText>
         </w:r>
         <w:r>
           <w:rPr>
@@ -3619,7 +3619,7 @@
           <w14:ligatures w14:val="standardContextual"/>
         </w:rPr>
       </w:pPr>
-      <w:hyperlink w:anchor="_Toc242421791" w:history="1">
+      <w:hyperlink w:anchor="_Toc242423233" w:history="1">
         <w:r>
           <w:rPr>
             <w:rStyle w:val="Hyperlink"/>
@@ -3647,7 +3647,7 @@
             <w:noProof/>
             <w:webHidden/>
           </w:rPr>
-          <w:instrText xml:space="preserve"> PAGEREF _Toc242421791 \h </w:instrText>
+          <w:instrText xml:space="preserve"> PAGEREF _Toc242423233 \h </w:instrText>
         </w:r>
         <w:r>
           <w:rPr>
@@ -3692,7 +3692,7 @@
           <w14:ligatures w14:val="standardContextual"/>
         </w:rPr>
       </w:pPr>
-      <w:hyperlink w:anchor="_Toc242421792" w:history="1">
+      <w:hyperlink w:anchor="_Toc242423234" w:history="1">
         <w:r>
           <w:rPr>
             <w:rStyle w:val="Hyperlink"/>
@@ -3720,7 +3720,7 @@
             <w:noProof/>
             <w:webHidden/>
           </w:rPr>
-          <w:instrText xml:space="preserve"> PAGEREF _Toc242421792 \h </w:instrText>
+          <w:instrText xml:space="preserve"> PAGEREF _Toc242423234 \h </w:instrText>
         </w:r>
         <w:r>
           <w:rPr>
@@ -3765,7 +3765,7 @@
           <w14:ligatures w14:val="standardContextual"/>
         </w:rPr>
       </w:pPr>
-      <w:hyperlink w:anchor="_Toc242421793" w:history="1">
+      <w:hyperlink w:anchor="_Toc242423235" w:history="1">
         <w:r>
           <w:rPr>
             <w:rStyle w:val="Hyperlink"/>
@@ -3793,7 +3793,7 @@
             <w:noProof/>
             <w:webHidden/>
           </w:rPr>
-          <w:instrText xml:space="preserve"> PAGEREF _Toc242421793 \h </w:instrText>
+          <w:instrText xml:space="preserve"> PAGEREF _Toc242423235 \h </w:instrText>
         </w:r>
         <w:r>
           <w:rPr>
@@ -3838,7 +3838,7 @@
           <w14:ligatures w14:val="standardContextual"/>
         </w:rPr>
       </w:pPr>
-      <w:hyperlink w:anchor="_Toc242421794" w:history="1">
+      <w:hyperlink w:anchor="_Toc242423236" w:history="1">
         <w:r>
           <w:rPr>
             <w:rStyle w:val="Hyperlink"/>
@@ -3866,7 +3866,7 @@
             <w:noProof/>
             <w:webHidden/>
           </w:rPr>
-          <w:instrText xml:space="preserve"> PAGEREF _Toc242421794 \h </w:instrText>
+          <w:instrText xml:space="preserve"> PAGEREF _Toc242423236 \h </w:instrText>
         </w:r>
         <w:r>
           <w:rPr>
@@ -3911,7 +3911,7 @@
           <w14:ligatures w14:val="standardContextual"/>
         </w:rPr>
       </w:pPr>
-      <w:hyperlink w:anchor="_Toc242421795" w:history="1">
+      <w:hyperlink w:anchor="_Toc242423237" w:history="1">
         <w:r>
           <w:rPr>
             <w:rStyle w:val="Hyperlink"/>
@@ -3939,7 +3939,7 @@
             <w:noProof/>
             <w:webHidden/>
           </w:rPr>
-          <w:instrText xml:space="preserve"> PAGEREF _Toc242421795 \h </w:instrText>
+          <w:instrText xml:space="preserve"> PAGEREF _Toc242423237 \h </w:instrText>
         </w:r>
         <w:r>
           <w:rPr>
@@ -3984,7 +3984,7 @@
           <w14:ligatures w14:val="standardContextual"/>
         </w:rPr>
       </w:pPr>
-      <w:hyperlink w:anchor="_Toc242421796" w:history="1">
+      <w:hyperlink w:anchor="_Toc242423238" w:history="1">
         <w:r>
           <w:rPr>
             <w:rStyle w:val="Hyperlink"/>
@@ -4012,7 +4012,7 @@
             <w:noProof/>
             <w:webHidden/>
           </w:rPr>
-          <w:instrText xml:space="preserve"> PAGEREF _Toc242421796 \h </w:instrText>
+          <w:instrText xml:space="preserve"> PAGEREF _Toc242423238 \h </w:instrText>
         </w:r>
         <w:r>
           <w:rPr>
@@ -4057,7 +4057,7 @@
           <w14:ligatures w14:val="standardContextual"/>
         </w:rPr>
       </w:pPr>
-      <w:hyperlink w:anchor="_Toc242421797" w:history="1">
+      <w:hyperlink w:anchor="_Toc242423239" w:history="1">
         <w:r>
           <w:rPr>
             <w:rStyle w:val="Hyperlink"/>
@@ -4085,7 +4085,7 @@
             <w:noProof/>
             <w:webHidden/>
           </w:rPr>
-          <w:instrText xml:space="preserve"> PAGEREF _Toc242421797 \h </w:instrText>
+          <w:instrText xml:space="preserve"> PAGEREF _Toc242423239 \h </w:instrText>
         </w:r>
         <w:r>
           <w:rPr>
@@ -4130,7 +4130,7 @@
           <w14:ligatures w14:val="standardContextual"/>
         </w:rPr>
       </w:pPr>
-      <w:hyperlink w:anchor="_Toc242421798" w:history="1">
+      <w:hyperlink w:anchor="_Toc242423240" w:history="1">
         <w:r>
           <w:rPr>
             <w:rStyle w:val="Hyperlink"/>
@@ -4158,7 +4158,7 @@
             <w:noProof/>
             <w:webHidden/>
           </w:rPr>
-          <w:instrText xml:space="preserve"> PAGEREF _Toc242421798 \h </w:instrText>
+          <w:instrText xml:space="preserve"> PAGEREF _Toc242423240 \h </w:instrText>
         </w:r>
         <w:r>
           <w:rPr>
@@ -4203,7 +4203,7 @@
           <w14:ligatures w14:val="standardContextual"/>
         </w:rPr>
       </w:pPr>
-      <w:hyperlink w:anchor="_Toc242421799" w:history="1">
+      <w:hyperlink w:anchor="_Toc242423241" w:history="1">
         <w:r>
           <w:rPr>
             <w:rStyle w:val="Hyperlink"/>
@@ -4231,7 +4231,7 @@
             <w:noProof/>
             <w:webHidden/>
           </w:rPr>
-          <w:instrText xml:space="preserve"> PAGEREF _Toc242421799 \h </w:instrText>
+          <w:instrText xml:space="preserve"> PAGEREF _Toc242423241 \h </w:instrText>
         </w:r>
         <w:r>
           <w:rPr>
@@ -4276,7 +4276,7 @@
           <w14:ligatures w14:val="standardContextual"/>
         </w:rPr>
       </w:pPr>
-      <w:hyperlink w:anchor="_Toc242421800" w:history="1">
+      <w:hyperlink w:anchor="_Toc242423242" w:history="1">
         <w:r>
           <w:rPr>
             <w:rStyle w:val="Hyperlink"/>
@@ -4304,7 +4304,7 @@
             <w:noProof/>
             <w:webHidden/>
           </w:rPr>
-          <w:instrText xml:space="preserve"> PAGEREF _Toc242421800 \h </w:instrText>
+          <w:instrText xml:space="preserve"> PAGEREF _Toc242423242 \h </w:instrText>
         </w:r>
         <w:r>
           <w:rPr>
@@ -4349,7 +4349,7 @@
           <w14:ligatures w14:val="standardContextual"/>
         </w:rPr>
       </w:pPr>
-      <w:hyperlink w:anchor="_Toc242421801" w:history="1">
+      <w:hyperlink w:anchor="_Toc242423243" w:history="1">
         <w:r>
           <w:rPr>
             <w:rStyle w:val="Hyperlink"/>
@@ -4377,7 +4377,7 @@
             <w:noProof/>
             <w:webHidden/>
           </w:rPr>
-          <w:instrText xml:space="preserve"> PAGEREF _Toc242421801 \h </w:instrText>
+          <w:instrText xml:space="preserve"> PAGEREF _Toc242423243 \h </w:instrText>
         </w:r>
         <w:r>
           <w:rPr>
@@ -4422,7 +4422,7 @@
           <w14:ligatures w14:val="standardContextual"/>
         </w:rPr>
       </w:pPr>
-      <w:hyperlink w:anchor="_Toc242421802" w:history="1">
+      <w:hyperlink w:anchor="_Toc242423244" w:history="1">
         <w:r>
           <w:rPr>
             <w:rStyle w:val="Hyperlink"/>
@@ -4450,7 +4450,7 @@
             <w:noProof/>
             <w:webHidden/>
           </w:rPr>
-          <w:instrText xml:space="preserve"> PAGEREF _Toc242421802 \h </w:instrText>
+          <w:instrText xml:space="preserve"> PAGEREF _Toc242423244 \h </w:instrText>
         </w:r>
         <w:r>
           <w:rPr>
@@ -4495,7 +4495,7 @@
           <w14:ligatures w14:val="standardContextual"/>
         </w:rPr>
       </w:pPr>
-      <w:hyperlink w:anchor="_Toc242421803" w:history="1">
+      <w:hyperlink w:anchor="_Toc242423245" w:history="1">
         <w:r>
           <w:rPr>
             <w:rStyle w:val="Hyperlink"/>
@@ -4523,7 +4523,7 @@
             <w:noProof/>
             <w:webHidden/>
           </w:rPr>
-          <w:instrText xml:space="preserve"> PAGEREF _Toc242421803 \h </w:instrText>
+          <w:instrText xml:space="preserve"> PAGEREF _Toc242423245 \h </w:instrText>
         </w:r>
         <w:r>
           <w:rPr>
@@ -4568,7 +4568,7 @@
           <w14:ligatures w14:val="standardContextual"/>
         </w:rPr>
       </w:pPr>
-      <w:hyperlink w:anchor="_Toc242421804" w:history="1">
+      <w:hyperlink w:anchor="_Toc242423246" w:history="1">
         <w:r>
           <w:rPr>
             <w:rStyle w:val="Hyperlink"/>
@@ -4596,7 +4596,7 @@
             <w:noProof/>
             <w:webHidden/>
           </w:rPr>
-          <w:instrText xml:space="preserve"> PAGEREF _Toc242421804 \h </w:instrText>
+          <w:instrText xml:space="preserve"> PAGEREF _Toc242423246 \h </w:instrText>
         </w:r>
         <w:r>
           <w:rPr>
@@ -4641,7 +4641,7 @@
           <w14:ligatures w14:val="standardContextual"/>
         </w:rPr>
       </w:pPr>
-      <w:hyperlink w:anchor="_Toc242421805" w:history="1">
+      <w:hyperlink w:anchor="_Toc242423247" w:history="1">
         <w:r>
           <w:rPr>
             <w:rStyle w:val="Hyperlink"/>
@@ -4669,7 +4669,7 @@
             <w:noProof/>
             <w:webHidden/>
           </w:rPr>
-          <w:instrText xml:space="preserve"> PAGEREF _Toc242421805 \h </w:instrText>
+          <w:instrText xml:space="preserve"> PAGEREF _Toc242423247 \h </w:instrText>
         </w:r>
         <w:r>
           <w:rPr>
@@ -4714,7 +4714,7 @@
           <w14:ligatures w14:val="standardContextual"/>
         </w:rPr>
       </w:pPr>
-      <w:hyperlink w:anchor="_Toc242421806" w:history="1">
+      <w:hyperlink w:anchor="_Toc242423248" w:history="1">
         <w:r>
           <w:rPr>
             <w:rStyle w:val="Hyperlink"/>
@@ -4742,7 +4742,7 @@
             <w:noProof/>
             <w:webHidden/>
           </w:rPr>
-          <w:instrText xml:space="preserve"> PAGEREF _Toc242421806 \h </w:instrText>
+          <w:instrText xml:space="preserve"> PAGEREF _Toc242423248 \h </w:instrText>
         </w:r>
         <w:r>
           <w:rPr>
@@ -4787,7 +4787,7 @@
           <w14:ligatures w14:val="standardContextual"/>
         </w:rPr>
       </w:pPr>
-      <w:hyperlink w:anchor="_Toc242421807" w:history="1">
+      <w:hyperlink w:anchor="_Toc242423249" w:history="1">
         <w:r>
           <w:rPr>
             <w:rStyle w:val="Hyperlink"/>
@@ -4815,7 +4815,7 @@
             <w:noProof/>
             <w:webHidden/>
           </w:rPr>
-          <w:instrText xml:space="preserve"> PAGEREF _Toc242421807 \h </w:instrText>
+          <w:instrText xml:space="preserve"> PAGEREF _Toc242423249 \h </w:instrText>
         </w:r>
         <w:r>
           <w:rPr>
@@ -4860,7 +4860,7 @@
           <w14:ligatures w14:val="standardContextual"/>
         </w:rPr>
       </w:pPr>
-      <w:hyperlink w:anchor="_Toc242421808" w:history="1">
+      <w:hyperlink w:anchor="_Toc242423250" w:history="1">
         <w:r>
           <w:rPr>
             <w:rStyle w:val="Hyperlink"/>
@@ -4888,7 +4888,7 @@
             <w:noProof/>
             <w:webHidden/>
           </w:rPr>
-          <w:instrText xml:space="preserve"> PAGEREF _Toc242421808 \h </w:instrText>
+          <w:instrText xml:space="preserve"> PAGEREF _Toc242423250 \h </w:instrText>
         </w:r>
         <w:r>
           <w:rPr>
@@ -4933,7 +4933,7 @@
           <w14:ligatures w14:val="standardContextual"/>
         </w:rPr>
       </w:pPr>
-      <w:hyperlink w:anchor="_Toc242421809" w:history="1">
+      <w:hyperlink w:anchor="_Toc242423251" w:history="1">
         <w:r>
           <w:rPr>
             <w:rStyle w:val="Hyperlink"/>
@@ -4961,7 +4961,7 @@
             <w:noProof/>
             <w:webHidden/>
           </w:rPr>
-          <w:instrText xml:space="preserve"> PAGEREF _Toc242421809 \h </w:instrText>
+          <w:instrText xml:space="preserve"> PAGEREF _Toc242423251 \h </w:instrText>
         </w:r>
         <w:r>
           <w:rPr>
@@ -5006,7 +5006,7 @@
           <w14:ligatures w14:val="standardContextual"/>
         </w:rPr>
       </w:pPr>
-      <w:hyperlink w:anchor="_Toc242421810" w:history="1">
+      <w:hyperlink w:anchor="_Toc242423252" w:history="1">
         <w:r>
           <w:rPr>
             <w:rStyle w:val="Hyperlink"/>
@@ -5034,7 +5034,7 @@
             <w:noProof/>
             <w:webHidden/>
           </w:rPr>
-          <w:instrText xml:space="preserve"> PAGEREF _Toc242421810 \h </w:instrText>
+          <w:instrText xml:space="preserve"> PAGEREF _Toc242423252 \h </w:instrText>
         </w:r>
         <w:r>
           <w:rPr>
@@ -5079,7 +5079,7 @@
           <w14:ligatures w14:val="standardContextual"/>
         </w:rPr>
       </w:pPr>
-      <w:hyperlink w:anchor="_Toc242421811" w:history="1">
+      <w:hyperlink w:anchor="_Toc242423253" w:history="1">
         <w:r>
           <w:rPr>
             <w:rStyle w:val="Hyperlink"/>
@@ -5107,7 +5107,7 @@
             <w:noProof/>
             <w:webHidden/>
           </w:rPr>
-          <w:instrText xml:space="preserve"> PAGEREF _Toc242421811 \h </w:instrText>
+          <w:instrText xml:space="preserve"> PAGEREF _Toc242423253 \h </w:instrText>
         </w:r>
         <w:r>
           <w:rPr>
@@ -5152,7 +5152,7 @@
           <w14:ligatures w14:val="standardContextual"/>
         </w:rPr>
       </w:pPr>
-      <w:hyperlink w:anchor="_Toc242421812" w:history="1">
+      <w:hyperlink w:anchor="_Toc242423254" w:history="1">
         <w:r>
           <w:rPr>
             <w:rStyle w:val="Hyperlink"/>
@@ -5180,7 +5180,7 @@
             <w:noProof/>
             <w:webHidden/>
           </w:rPr>
-          <w:instrText xml:space="preserve"> PAGEREF _Toc242421812 \h </w:instrText>
+          <w:instrText xml:space="preserve"> PAGEREF _Toc242423254 \h </w:instrText>
         </w:r>
         <w:r>
           <w:rPr>
@@ -5225,7 +5225,7 @@
           <w14:ligatures w14:val="standardContextual"/>
         </w:rPr>
       </w:pPr>
-      <w:hyperlink w:anchor="_Toc242421813" w:history="1">
+      <w:hyperlink w:anchor="_Toc242423255" w:history="1">
         <w:r>
           <w:rPr>
             <w:rStyle w:val="Hyperlink"/>
@@ -5253,7 +5253,7 @@
             <w:noProof/>
             <w:webHidden/>
           </w:rPr>
-          <w:instrText xml:space="preserve"> PAGEREF _Toc242421813 \h </w:instrText>
+          <w:instrText xml:space="preserve"> PAGEREF _Toc242423255 \h </w:instrText>
         </w:r>
         <w:r>
           <w:rPr>
@@ -5298,7 +5298,7 @@
           <w14:ligatures w14:val="standardContextual"/>
         </w:rPr>
       </w:pPr>
-      <w:hyperlink w:anchor="_Toc242421814" w:history="1">
+      <w:hyperlink w:anchor="_Toc242423256" w:history="1">
         <w:r>
           <w:rPr>
             <w:rStyle w:val="Hyperlink"/>
@@ -5326,7 +5326,7 @@
             <w:noProof/>
             <w:webHidden/>
           </w:rPr>
-          <w:instrText xml:space="preserve"> PAGEREF _Toc242421814 \h </w:instrText>
+          <w:instrText xml:space="preserve"> PAGEREF _Toc242423256 \h </w:instrText>
         </w:r>
         <w:r>
           <w:rPr>
@@ -5371,7 +5371,7 @@
           <w14:ligatures w14:val="standardContextual"/>
         </w:rPr>
       </w:pPr>
-      <w:hyperlink w:anchor="_Toc242421815" w:history="1">
+      <w:hyperlink w:anchor="_Toc242423257" w:history="1">
         <w:r>
           <w:rPr>
             <w:rStyle w:val="Hyperlink"/>
@@ -5399,7 +5399,7 @@
             <w:noProof/>
             <w:webHidden/>
           </w:rPr>
-          <w:instrText xml:space="preserve"> PAGEREF _Toc242421815 \h </w:instrText>
+          <w:instrText xml:space="preserve"> PAGEREF _Toc242423257 \h </w:instrText>
         </w:r>
         <w:r>
           <w:rPr>
@@ -5444,7 +5444,7 @@
           <w14:ligatures w14:val="standardContextual"/>
         </w:rPr>
       </w:pPr>
-      <w:hyperlink w:anchor="_Toc242421816" w:history="1">
+      <w:hyperlink w:anchor="_Toc242423258" w:history="1">
         <w:r>
           <w:rPr>
             <w:rStyle w:val="Hyperlink"/>
@@ -5472,7 +5472,7 @@
             <w:noProof/>
             <w:webHidden/>
           </w:rPr>
-          <w:instrText xml:space="preserve"> PAGEREF _Toc242421816 \h </w:instrText>
+          <w:instrText xml:space="preserve"> PAGEREF _Toc242423258 \h </w:instrText>
         </w:r>
         <w:r>
           <w:rPr>
@@ -5517,7 +5517,7 @@
           <w14:ligatures w14:val="standardContextual"/>
         </w:rPr>
       </w:pPr>
-      <w:hyperlink w:anchor="_Toc242421817" w:history="1">
+      <w:hyperlink w:anchor="_Toc242423259" w:history="1">
         <w:r>
           <w:rPr>
             <w:rStyle w:val="Hyperlink"/>
@@ -5545,7 +5545,7 @@
             <w:noProof/>
             <w:webHidden/>
           </w:rPr>
-          <w:instrText xml:space="preserve"> PAGEREF _Toc242421817 \h </w:instrText>
+          <w:instrText xml:space="preserve"> PAGEREF _Toc242423259 \h </w:instrText>
         </w:r>
         <w:r>
           <w:rPr>
@@ -5590,7 +5590,7 @@
           <w14:ligatures w14:val="standardContextual"/>
         </w:rPr>
       </w:pPr>
-      <w:hyperlink w:anchor="_Toc242421818" w:history="1">
+      <w:hyperlink w:anchor="_Toc242423260" w:history="1">
         <w:r>
           <w:rPr>
             <w:rStyle w:val="Hyperlink"/>
@@ -5618,7 +5618,7 @@
             <w:noProof/>
             <w:webHidden/>
           </w:rPr>
-          <w:instrText xml:space="preserve"> PAGEREF _Toc242421818 \h </w:instrText>
+          <w:instrText xml:space="preserve"> PAGEREF _Toc242423260 \h </w:instrText>
         </w:r>
         <w:r>
           <w:rPr>
@@ -5663,7 +5663,7 @@
           <w14:ligatures w14:val="standardContextual"/>
         </w:rPr>
       </w:pPr>
-      <w:hyperlink w:anchor="_Toc242421819" w:history="1">
+      <w:hyperlink w:anchor="_Toc242423261" w:history="1">
         <w:r>
           <w:rPr>
             <w:rStyle w:val="Hyperlink"/>
@@ -5691,7 +5691,7 @@
             <w:noProof/>
             <w:webHidden/>
           </w:rPr>
-          <w:instrText xml:space="preserve"> PAGEREF _Toc242421819 \h </w:instrText>
+          <w:instrText xml:space="preserve"> PAGEREF _Toc242423261 \h </w:instrText>
         </w:r>
         <w:r>
           <w:rPr>
@@ -5736,7 +5736,7 @@
           <w14:ligatures w14:val="standardContextual"/>
         </w:rPr>
       </w:pPr>
-      <w:hyperlink w:anchor="_Toc242421820" w:history="1">
+      <w:hyperlink w:anchor="_Toc242423262" w:history="1">
         <w:r>
           <w:rPr>
             <w:rStyle w:val="Hyperlink"/>
@@ -5764,7 +5764,7 @@
             <w:noProof/>
             <w:webHidden/>
           </w:rPr>
-          <w:instrText xml:space="preserve"> PAGEREF _Toc242421820 \h </w:instrText>
+          <w:instrText xml:space="preserve"> PAGEREF _Toc242423262 \h </w:instrText>
         </w:r>
         <w:r>
           <w:rPr>
@@ -5809,7 +5809,7 @@
           <w14:ligatures w14:val="standardContextual"/>
         </w:rPr>
       </w:pPr>
-      <w:hyperlink w:anchor="_Toc242421821" w:history="1">
+      <w:hyperlink w:anchor="_Toc242423263" w:history="1">
         <w:r>
           <w:rPr>
             <w:rStyle w:val="Hyperlink"/>
@@ -5837,7 +5837,7 @@
             <w:noProof/>
             <w:webHidden/>
           </w:rPr>
-          <w:instrText xml:space="preserve"> PAGEREF _Toc242421821 \h </w:instrText>
+          <w:instrText xml:space="preserve"> PAGEREF _Toc242423263 \h </w:instrText>
         </w:r>
         <w:r>
           <w:rPr>
@@ -5882,7 +5882,7 @@
           <w14:ligatures w14:val="standardContextual"/>
         </w:rPr>
       </w:pPr>
-      <w:hyperlink w:anchor="_Toc242421822" w:history="1">
+      <w:hyperlink w:anchor="_Toc242423264" w:history="1">
         <w:r>
           <w:rPr>
             <w:rStyle w:val="Hyperlink"/>
@@ -5910,7 +5910,7 @@
             <w:noProof/>
             <w:webHidden/>
           </w:rPr>
-          <w:instrText xml:space="preserve"> PAGEREF _Toc242421822 \h </w:instrText>
+          <w:instrText xml:space="preserve"> PAGEREF _Toc242423264 \h </w:instrText>
         </w:r>
         <w:r>
           <w:rPr>
@@ -5955,7 +5955,7 @@
           <w14:ligatures w14:val="standardContextual"/>
         </w:rPr>
       </w:pPr>
-      <w:hyperlink w:anchor="_Toc242421823" w:history="1">
+      <w:hyperlink w:anchor="_Toc242423265" w:history="1">
         <w:r>
           <w:rPr>
             <w:rStyle w:val="Hyperlink"/>
@@ -5983,7 +5983,7 @@
             <w:noProof/>
             <w:webHidden/>
           </w:rPr>
-          <w:instrText xml:space="preserve"> PAGEREF _Toc242421823 \h </w:instrText>
+          <w:instrText xml:space="preserve"> PAGEREF _Toc242423265 \h </w:instrText>
         </w:r>
         <w:r>
           <w:rPr>
@@ -6028,7 +6028,7 @@
           <w14:ligatures w14:val="standardContextual"/>
         </w:rPr>
       </w:pPr>
-      <w:hyperlink w:anchor="_Toc242421824" w:history="1">
+      <w:hyperlink w:anchor="_Toc242423266" w:history="1">
         <w:r>
           <w:rPr>
             <w:rStyle w:val="Hyperlink"/>
@@ -6056,7 +6056,7 @@
             <w:noProof/>
             <w:webHidden/>
           </w:rPr>
-          <w:instrText xml:space="preserve"> PAGEREF _Toc242421824 \h </w:instrText>
+          <w:instrText xml:space="preserve"> PAGEREF _Toc242423266 \h </w:instrText>
         </w:r>
         <w:r>
           <w:rPr>
@@ -6101,7 +6101,7 @@
           <w14:ligatures w14:val="standardContextual"/>
         </w:rPr>
       </w:pPr>
-      <w:hyperlink w:anchor="_Toc242421825" w:history="1">
+      <w:hyperlink w:anchor="_Toc242423267" w:history="1">
         <w:r>
           <w:rPr>
             <w:rStyle w:val="Hyperlink"/>
@@ -6129,7 +6129,7 @@
             <w:noProof/>
             <w:webHidden/>
           </w:rPr>
-          <w:instrText xml:space="preserve"> PAGEREF _Toc242421825 \h </w:instrText>
+          <w:instrText xml:space="preserve"> PAGEREF _Toc242423267 \h </w:instrText>
         </w:r>
         <w:r>
           <w:rPr>
@@ -6149,7 +6149,80 @@
             <w:noProof/>
             <w:webHidden/>
           </w:rPr>
-          <w:t>45</w:t>
+          <w:t>46</w:t>
+        </w:r>
+        <w:r>
+          <w:rPr>
+            <w:noProof/>
+            <w:webHidden/>
+          </w:rPr>
+          <w:fldChar w:fldCharType="end"/>
+        </w:r>
+      </w:hyperlink>
+    </w:p>
+    <w:p>
+      <w:pPr>
+        <w:pStyle w:val="TOC2"/>
+        <w:tabs>
+          <w:tab w:val="right" w:leader="dot" w:pos="9679"/>
+        </w:tabs>
+        <w:rPr>
+          <w:rFonts w:asciiTheme="minorHAnsi" w:eastAsiaTheme="minorEastAsia" w:hAnsiTheme="minorHAnsi" w:cstheme="minorBidi"/>
+          <w:noProof/>
+          <w:kern w:val="2"/>
+          <w:szCs w:val="24"/>
+          <w14:ligatures w14:val="standardContextual"/>
+        </w:rPr>
+      </w:pPr>
+      <w:hyperlink w:anchor="_Toc242423268" w:history="1">
+        <w:r>
+          <w:rPr>
+            <w:rStyle w:val="Hyperlink"/>
+            <w:rFonts w:eastAsiaTheme="majorEastAsia"/>
+            <w:noProof/>
+          </w:rPr>
+          <w:t>B.4. Ghi nhận phần C3 Nhật Huy đã bàn giao và tích hợp</w:t>
+        </w:r>
+        <w:r>
+          <w:rPr>
+            <w:noProof/>
+            <w:webHidden/>
+          </w:rPr>
+          <w:tab/>
+        </w:r>
+        <w:r>
+          <w:rPr>
+            <w:noProof/>
+            <w:webHidden/>
+          </w:rPr>
+          <w:fldChar w:fldCharType="begin"/>
+        </w:r>
+        <w:r>
+          <w:rPr>
+            <w:noProof/>
+            <w:webHidden/>
+          </w:rPr>
+          <w:instrText xml:space="preserve"> PAGEREF _Toc242423268 \h </w:instrText>
+        </w:r>
+        <w:r>
+          <w:rPr>
+            <w:noProof/>
+            <w:webHidden/>
+          </w:rPr>
+        </w:r>
+        <w:r>
+          <w:rPr>
+            <w:noProof/>
+            <w:webHidden/>
+          </w:rPr>
+          <w:fldChar w:fldCharType="separate"/>
+        </w:r>
+        <w:r>
+          <w:rPr>
+            <w:noProof/>
+            <w:webHidden/>
+          </w:rPr>
+          <w:t>46</w:t>
         </w:r>
         <w:r>
           <w:rPr>
@@ -6169,7 +6242,7 @@
       <w:pPr>
         <w:pStyle w:val="Heading1"/>
       </w:pPr>
-      <w:bookmarkStart w:id="3" w:name="_Toc242421750"/>
+      <w:bookmarkStart w:id="3" w:name="_Toc242423192"/>
       <w:r>
         <w:lastRenderedPageBreak/>
         <w:t>DANH MỤC HÌNH</w:t>
@@ -6199,7 +6272,7 @@
       <w:r>
         <w:fldChar w:fldCharType="separate"/>
       </w:r>
-      <w:hyperlink w:anchor="_Toc242421826" w:history="1">
+      <w:hyperlink w:anchor="_Toc242423269" w:history="1">
         <w:r>
           <w:rPr>
             <w:rStyle w:val="Hyperlink"/>
@@ -6227,7 +6300,7 @@
             <w:noProof/>
             <w:webHidden/>
           </w:rPr>
-          <w:instrText xml:space="preserve"> PAGEREF _Toc242421826 \h </w:instrText>
+          <w:instrText xml:space="preserve"> PAGEREF _Toc242423269 \h </w:instrText>
         </w:r>
         <w:r>
           <w:rPr>
@@ -6272,7 +6345,7 @@
           <w14:ligatures w14:val="standardContextual"/>
         </w:rPr>
       </w:pPr>
-      <w:hyperlink w:anchor="_Toc242421827" w:history="1">
+      <w:hyperlink w:anchor="_Toc242423270" w:history="1">
         <w:r>
           <w:rPr>
             <w:rStyle w:val="Hyperlink"/>
@@ -6300,7 +6373,7 @@
             <w:noProof/>
             <w:webHidden/>
           </w:rPr>
-          <w:instrText xml:space="preserve"> PAGEREF _Toc242421827 \h </w:instrText>
+          <w:instrText xml:space="preserve"> PAGEREF _Toc242423270 \h </w:instrText>
         </w:r>
         <w:r>
           <w:rPr>
@@ -6345,7 +6418,7 @@
           <w14:ligatures w14:val="standardContextual"/>
         </w:rPr>
       </w:pPr>
-      <w:hyperlink w:anchor="_Toc242421828" w:history="1">
+      <w:hyperlink w:anchor="_Toc242423271" w:history="1">
         <w:r>
           <w:rPr>
             <w:rStyle w:val="Hyperlink"/>
@@ -6373,7 +6446,7 @@
             <w:noProof/>
             <w:webHidden/>
           </w:rPr>
-          <w:instrText xml:space="preserve"> PAGEREF _Toc242421828 \h </w:instrText>
+          <w:instrText xml:space="preserve"> PAGEREF _Toc242423271 \h </w:instrText>
         </w:r>
         <w:r>
           <w:rPr>
@@ -6418,7 +6491,7 @@
           <w14:ligatures w14:val="standardContextual"/>
         </w:rPr>
       </w:pPr>
-      <w:hyperlink w:anchor="_Toc242421829" w:history="1">
+      <w:hyperlink w:anchor="_Toc242423272" w:history="1">
         <w:r>
           <w:rPr>
             <w:rStyle w:val="Hyperlink"/>
@@ -6446,7 +6519,7 @@
             <w:noProof/>
             <w:webHidden/>
           </w:rPr>
-          <w:instrText xml:space="preserve"> PAGEREF _Toc242421829 \h </w:instrText>
+          <w:instrText xml:space="preserve"> PAGEREF _Toc242423272 \h </w:instrText>
         </w:r>
         <w:r>
           <w:rPr>
@@ -6491,7 +6564,7 @@
           <w14:ligatures w14:val="standardContextual"/>
         </w:rPr>
       </w:pPr>
-      <w:hyperlink w:anchor="_Toc242421830" w:history="1">
+      <w:hyperlink w:anchor="_Toc242423273" w:history="1">
         <w:r>
           <w:rPr>
             <w:rStyle w:val="Hyperlink"/>
@@ -6519,7 +6592,7 @@
             <w:noProof/>
             <w:webHidden/>
           </w:rPr>
-          <w:instrText xml:space="preserve"> PAGEREF _Toc242421830 \h </w:instrText>
+          <w:instrText xml:space="preserve"> PAGEREF _Toc242423273 \h </w:instrText>
         </w:r>
         <w:r>
           <w:rPr>
@@ -6564,7 +6637,7 @@
           <w14:ligatures w14:val="standardContextual"/>
         </w:rPr>
       </w:pPr>
-      <w:hyperlink w:anchor="_Toc242421831" w:history="1">
+      <w:hyperlink w:anchor="_Toc242423274" w:history="1">
         <w:r>
           <w:rPr>
             <w:rStyle w:val="Hyperlink"/>
@@ -6592,7 +6665,7 @@
             <w:noProof/>
             <w:webHidden/>
           </w:rPr>
-          <w:instrText xml:space="preserve"> PAGEREF _Toc242421831 \h </w:instrText>
+          <w:instrText xml:space="preserve"> PAGEREF _Toc242423274 \h </w:instrText>
         </w:r>
         <w:r>
           <w:rPr>
@@ -6637,7 +6710,7 @@
           <w14:ligatures w14:val="standardContextual"/>
         </w:rPr>
       </w:pPr>
-      <w:hyperlink w:anchor="_Toc242421832" w:history="1">
+      <w:hyperlink w:anchor="_Toc242423275" w:history="1">
         <w:r>
           <w:rPr>
             <w:rStyle w:val="Hyperlink"/>
@@ -6665,7 +6738,7 @@
             <w:noProof/>
             <w:webHidden/>
           </w:rPr>
-          <w:instrText xml:space="preserve"> PAGEREF _Toc242421832 \h </w:instrText>
+          <w:instrText xml:space="preserve"> PAGEREF _Toc242423275 \h </w:instrText>
         </w:r>
         <w:r>
           <w:rPr>
@@ -6705,7 +6778,7 @@
       <w:pPr>
         <w:pStyle w:val="Heading1"/>
       </w:pPr>
-      <w:bookmarkStart w:id="4" w:name="_Toc242421751"/>
+      <w:bookmarkStart w:id="4" w:name="_Toc242423193"/>
       <w:r>
         <w:lastRenderedPageBreak/>
         <w:t>DANH MỤC BẢNG</w:t>
@@ -6735,7 +6808,7 @@
       <w:r>
         <w:fldChar w:fldCharType="separate"/>
       </w:r>
-      <w:hyperlink w:anchor="_Toc242421833" w:history="1">
+      <w:hyperlink w:anchor="_Toc242423276" w:history="1">
         <w:r>
           <w:rPr>
             <w:rStyle w:val="Hyperlink"/>
@@ -6763,7 +6836,7 @@
             <w:noProof/>
             <w:webHidden/>
           </w:rPr>
-          <w:instrText xml:space="preserve"> PAGEREF _Toc242421833 \h </w:instrText>
+          <w:instrText xml:space="preserve"> PAGEREF _Toc242423276 \h </w:instrText>
         </w:r>
         <w:r>
           <w:rPr>
@@ -6808,7 +6881,7 @@
           <w14:ligatures w14:val="standardContextual"/>
         </w:rPr>
       </w:pPr>
-      <w:hyperlink w:anchor="_Toc242421834" w:history="1">
+      <w:hyperlink w:anchor="_Toc242423277" w:history="1">
         <w:r>
           <w:rPr>
             <w:rStyle w:val="Hyperlink"/>
@@ -6836,7 +6909,7 @@
             <w:noProof/>
             <w:webHidden/>
           </w:rPr>
-          <w:instrText xml:space="preserve"> PAGEREF _Toc242421834 \h </w:instrText>
+          <w:instrText xml:space="preserve"> PAGEREF _Toc242423277 \h </w:instrText>
         </w:r>
         <w:r>
           <w:rPr>
@@ -6881,7 +6954,7 @@
           <w14:ligatures w14:val="standardContextual"/>
         </w:rPr>
       </w:pPr>
-      <w:hyperlink w:anchor="_Toc242421835" w:history="1">
+      <w:hyperlink w:anchor="_Toc242423278" w:history="1">
         <w:r>
           <w:rPr>
             <w:rStyle w:val="Hyperlink"/>
@@ -6909,7 +6982,7 @@
             <w:noProof/>
             <w:webHidden/>
           </w:rPr>
-          <w:instrText xml:space="preserve"> PAGEREF _Toc242421835 \h </w:instrText>
+          <w:instrText xml:space="preserve"> PAGEREF _Toc242423278 \h </w:instrText>
         </w:r>
         <w:r>
           <w:rPr>
@@ -6954,7 +7027,7 @@
           <w14:ligatures w14:val="standardContextual"/>
         </w:rPr>
       </w:pPr>
-      <w:hyperlink w:anchor="_Toc242421836" w:history="1">
+      <w:hyperlink w:anchor="_Toc242423279" w:history="1">
         <w:r>
           <w:rPr>
             <w:rStyle w:val="Hyperlink"/>
@@ -6982,7 +7055,7 @@
             <w:noProof/>
             <w:webHidden/>
           </w:rPr>
-          <w:instrText xml:space="preserve"> PAGEREF _Toc242421836 \h </w:instrText>
+          <w:instrText xml:space="preserve"> PAGEREF _Toc242423279 \h </w:instrText>
         </w:r>
         <w:r>
           <w:rPr>
@@ -7027,7 +7100,7 @@
           <w14:ligatures w14:val="standardContextual"/>
         </w:rPr>
       </w:pPr>
-      <w:hyperlink w:anchor="_Toc242421837" w:history="1">
+      <w:hyperlink w:anchor="_Toc242423280" w:history="1">
         <w:r>
           <w:rPr>
             <w:rStyle w:val="Hyperlink"/>
@@ -7055,7 +7128,7 @@
             <w:noProof/>
             <w:webHidden/>
           </w:rPr>
-          <w:instrText xml:space="preserve"> PAGEREF _Toc242421837 \h </w:instrText>
+          <w:instrText xml:space="preserve"> PAGEREF _Toc242423280 \h </w:instrText>
         </w:r>
         <w:r>
           <w:rPr>
@@ -7100,7 +7173,7 @@
           <w14:ligatures w14:val="standardContextual"/>
         </w:rPr>
       </w:pPr>
-      <w:hyperlink w:anchor="_Toc242421838" w:history="1">
+      <w:hyperlink w:anchor="_Toc242423281" w:history="1">
         <w:r>
           <w:rPr>
             <w:rStyle w:val="Hyperlink"/>
@@ -7128,7 +7201,7 @@
             <w:noProof/>
             <w:webHidden/>
           </w:rPr>
-          <w:instrText xml:space="preserve"> PAGEREF _Toc242421838 \h </w:instrText>
+          <w:instrText xml:space="preserve"> PAGEREF _Toc242423281 \h </w:instrText>
         </w:r>
         <w:r>
           <w:rPr>
@@ -7173,7 +7246,7 @@
           <w14:ligatures w14:val="standardContextual"/>
         </w:rPr>
       </w:pPr>
-      <w:hyperlink w:anchor="_Toc242421839" w:history="1">
+      <w:hyperlink w:anchor="_Toc242423282" w:history="1">
         <w:r>
           <w:rPr>
             <w:rStyle w:val="Hyperlink"/>
@@ -7201,7 +7274,7 @@
             <w:noProof/>
             <w:webHidden/>
           </w:rPr>
-          <w:instrText xml:space="preserve"> PAGEREF _Toc242421839 \h </w:instrText>
+          <w:instrText xml:space="preserve"> PAGEREF _Toc242423282 \h </w:instrText>
         </w:r>
         <w:r>
           <w:rPr>
@@ -7246,7 +7319,7 @@
           <w14:ligatures w14:val="standardContextual"/>
         </w:rPr>
       </w:pPr>
-      <w:hyperlink w:anchor="_Toc242421840" w:history="1">
+      <w:hyperlink w:anchor="_Toc242423283" w:history="1">
         <w:r>
           <w:rPr>
             <w:rStyle w:val="Hyperlink"/>
@@ -7274,7 +7347,7 @@
             <w:noProof/>
             <w:webHidden/>
           </w:rPr>
-          <w:instrText xml:space="preserve"> PAGEREF _Toc242421840 \h </w:instrText>
+          <w:instrText xml:space="preserve"> PAGEREF _Toc242423283 \h </w:instrText>
         </w:r>
         <w:r>
           <w:rPr>
@@ -7319,7 +7392,7 @@
           <w14:ligatures w14:val="standardContextual"/>
         </w:rPr>
       </w:pPr>
-      <w:hyperlink w:anchor="_Toc242421841" w:history="1">
+      <w:hyperlink w:anchor="_Toc242423284" w:history="1">
         <w:r>
           <w:rPr>
             <w:rStyle w:val="Hyperlink"/>
@@ -7347,7 +7420,7 @@
             <w:noProof/>
             <w:webHidden/>
           </w:rPr>
-          <w:instrText xml:space="preserve"> PAGEREF _Toc242421841 \h </w:instrText>
+          <w:instrText xml:space="preserve"> PAGEREF _Toc242423284 \h </w:instrText>
         </w:r>
         <w:r>
           <w:rPr>
@@ -7392,7 +7465,7 @@
           <w14:ligatures w14:val="standardContextual"/>
         </w:rPr>
       </w:pPr>
-      <w:hyperlink w:anchor="_Toc242421842" w:history="1">
+      <w:hyperlink w:anchor="_Toc242423285" w:history="1">
         <w:r>
           <w:rPr>
             <w:rStyle w:val="Hyperlink"/>
@@ -7420,7 +7493,7 @@
             <w:noProof/>
             <w:webHidden/>
           </w:rPr>
-          <w:instrText xml:space="preserve"> PAGEREF _Toc242421842 \h </w:instrText>
+          <w:instrText xml:space="preserve"> PAGEREF _Toc242423285 \h </w:instrText>
         </w:r>
         <w:r>
           <w:rPr>
@@ -7465,7 +7538,7 @@
           <w14:ligatures w14:val="standardContextual"/>
         </w:rPr>
       </w:pPr>
-      <w:hyperlink w:anchor="_Toc242421843" w:history="1">
+      <w:hyperlink w:anchor="_Toc242423286" w:history="1">
         <w:r>
           <w:rPr>
             <w:rStyle w:val="Hyperlink"/>
@@ -7493,7 +7566,7 @@
             <w:noProof/>
             <w:webHidden/>
           </w:rPr>
-          <w:instrText xml:space="preserve"> PAGEREF _Toc242421843 \h </w:instrText>
+          <w:instrText xml:space="preserve"> PAGEREF _Toc242423286 \h </w:instrText>
         </w:r>
         <w:r>
           <w:rPr>
@@ -7538,7 +7611,7 @@
           <w14:ligatures w14:val="standardContextual"/>
         </w:rPr>
       </w:pPr>
-      <w:hyperlink w:anchor="_Toc242421844" w:history="1">
+      <w:hyperlink w:anchor="_Toc242423287" w:history="1">
         <w:r>
           <w:rPr>
             <w:rStyle w:val="Hyperlink"/>
@@ -7566,7 +7639,7 @@
             <w:noProof/>
             <w:webHidden/>
           </w:rPr>
-          <w:instrText xml:space="preserve"> PAGEREF _Toc242421844 \h </w:instrText>
+          <w:instrText xml:space="preserve"> PAGEREF _Toc242423287 \h </w:instrText>
         </w:r>
         <w:r>
           <w:rPr>
@@ -7611,7 +7684,7 @@
           <w14:ligatures w14:val="standardContextual"/>
         </w:rPr>
       </w:pPr>
-      <w:hyperlink w:anchor="_Toc242421845" w:history="1">
+      <w:hyperlink w:anchor="_Toc242423288" w:history="1">
         <w:r>
           <w:rPr>
             <w:rStyle w:val="Hyperlink"/>
@@ -7639,7 +7712,7 @@
             <w:noProof/>
             <w:webHidden/>
           </w:rPr>
-          <w:instrText xml:space="preserve"> PAGEREF _Toc242421845 \h </w:instrText>
+          <w:instrText xml:space="preserve"> PAGEREF _Toc242423288 \h </w:instrText>
         </w:r>
         <w:r>
           <w:rPr>
@@ -7684,7 +7757,7 @@
           <w14:ligatures w14:val="standardContextual"/>
         </w:rPr>
       </w:pPr>
-      <w:hyperlink w:anchor="_Toc242421846" w:history="1">
+      <w:hyperlink w:anchor="_Toc242423289" w:history="1">
         <w:r>
           <w:rPr>
             <w:rStyle w:val="Hyperlink"/>
@@ -7712,7 +7785,7 @@
             <w:noProof/>
             <w:webHidden/>
           </w:rPr>
-          <w:instrText xml:space="preserve"> PAGEREF _Toc242421846 \h </w:instrText>
+          <w:instrText xml:space="preserve"> PAGEREF _Toc242423289 \h </w:instrText>
         </w:r>
         <w:r>
           <w:rPr>
@@ -7757,7 +7830,7 @@
           <w14:ligatures w14:val="standardContextual"/>
         </w:rPr>
       </w:pPr>
-      <w:hyperlink w:anchor="_Toc242421847" w:history="1">
+      <w:hyperlink w:anchor="_Toc242423290" w:history="1">
         <w:r>
           <w:rPr>
             <w:rStyle w:val="Hyperlink"/>
@@ -7785,7 +7858,7 @@
             <w:noProof/>
             <w:webHidden/>
           </w:rPr>
-          <w:instrText xml:space="preserve"> PAGEREF _Toc242421847 \h </w:instrText>
+          <w:instrText xml:space="preserve"> PAGEREF _Toc242423290 \h </w:instrText>
         </w:r>
         <w:r>
           <w:rPr>
@@ -7830,7 +7903,7 @@
           <w14:ligatures w14:val="standardContextual"/>
         </w:rPr>
       </w:pPr>
-      <w:hyperlink w:anchor="_Toc242421848" w:history="1">
+      <w:hyperlink w:anchor="_Toc242423291" w:history="1">
         <w:r>
           <w:rPr>
             <w:rStyle w:val="Hyperlink"/>
@@ -7858,7 +7931,7 @@
             <w:noProof/>
             <w:webHidden/>
           </w:rPr>
-          <w:instrText xml:space="preserve"> PAGEREF _Toc242421848 \h </w:instrText>
+          <w:instrText xml:space="preserve"> PAGEREF _Toc242423291 \h </w:instrText>
         </w:r>
         <w:r>
           <w:rPr>
@@ -7903,7 +7976,7 @@
           <w14:ligatures w14:val="standardContextual"/>
         </w:rPr>
       </w:pPr>
-      <w:hyperlink w:anchor="_Toc242421849" w:history="1">
+      <w:hyperlink w:anchor="_Toc242423292" w:history="1">
         <w:r>
           <w:rPr>
             <w:rStyle w:val="Hyperlink"/>
@@ -7931,7 +8004,7 @@
             <w:noProof/>
             <w:webHidden/>
           </w:rPr>
-          <w:instrText xml:space="preserve"> PAGEREF _Toc242421849 \h </w:instrText>
+          <w:instrText xml:space="preserve"> PAGEREF _Toc242423292 \h </w:instrText>
         </w:r>
         <w:r>
           <w:rPr>
@@ -7976,7 +8049,7 @@
           <w14:ligatures w14:val="standardContextual"/>
         </w:rPr>
       </w:pPr>
-      <w:hyperlink w:anchor="_Toc242421850" w:history="1">
+      <w:hyperlink w:anchor="_Toc242423293" w:history="1">
         <w:r>
           <w:rPr>
             <w:rStyle w:val="Hyperlink"/>
@@ -8004,7 +8077,7 @@
             <w:noProof/>
             <w:webHidden/>
           </w:rPr>
-          <w:instrText xml:space="preserve"> PAGEREF _Toc242421850 \h </w:instrText>
+          <w:instrText xml:space="preserve"> PAGEREF _Toc242423293 \h </w:instrText>
         </w:r>
         <w:r>
           <w:rPr>
@@ -8049,7 +8122,7 @@
           <w14:ligatures w14:val="standardContextual"/>
         </w:rPr>
       </w:pPr>
-      <w:hyperlink w:anchor="_Toc242421851" w:history="1">
+      <w:hyperlink w:anchor="_Toc242423294" w:history="1">
         <w:r>
           <w:rPr>
             <w:rStyle w:val="Hyperlink"/>
@@ -8077,7 +8150,7 @@
             <w:noProof/>
             <w:webHidden/>
           </w:rPr>
-          <w:instrText xml:space="preserve"> PAGEREF _Toc242421851 \h </w:instrText>
+          <w:instrText xml:space="preserve"> PAGEREF _Toc242423294 \h </w:instrText>
         </w:r>
         <w:r>
           <w:rPr>
@@ -8098,6 +8171,79 @@
             <w:webHidden/>
           </w:rPr>
           <w:t>45</w:t>
+        </w:r>
+        <w:r>
+          <w:rPr>
+            <w:noProof/>
+            <w:webHidden/>
+          </w:rPr>
+          <w:fldChar w:fldCharType="end"/>
+        </w:r>
+      </w:hyperlink>
+    </w:p>
+    <w:p>
+      <w:pPr>
+        <w:pStyle w:val="TOC1"/>
+        <w:tabs>
+          <w:tab w:val="right" w:leader="dot" w:pos="9679"/>
+        </w:tabs>
+        <w:rPr>
+          <w:rFonts w:asciiTheme="minorHAnsi" w:eastAsiaTheme="minorEastAsia" w:hAnsiTheme="minorHAnsi" w:cstheme="minorBidi"/>
+          <w:noProof/>
+          <w:kern w:val="2"/>
+          <w:szCs w:val="24"/>
+          <w14:ligatures w14:val="standardContextual"/>
+        </w:rPr>
+      </w:pPr>
+      <w:hyperlink w:anchor="_Toc242423295" w:history="1">
+        <w:r>
+          <w:rPr>
+            <w:rStyle w:val="Hyperlink"/>
+            <w:rFonts w:eastAsiaTheme="majorEastAsia"/>
+            <w:noProof/>
+          </w:rPr>
+          <w:t>Bảng B-2. Hai bộ thực nghiệm DistilBERT được đọc riêng.</w:t>
+        </w:r>
+        <w:r>
+          <w:rPr>
+            <w:noProof/>
+            <w:webHidden/>
+          </w:rPr>
+          <w:tab/>
+        </w:r>
+        <w:r>
+          <w:rPr>
+            <w:noProof/>
+            <w:webHidden/>
+          </w:rPr>
+          <w:fldChar w:fldCharType="begin"/>
+        </w:r>
+        <w:r>
+          <w:rPr>
+            <w:noProof/>
+            <w:webHidden/>
+          </w:rPr>
+          <w:instrText xml:space="preserve"> PAGEREF _Toc242423295 \h </w:instrText>
+        </w:r>
+        <w:r>
+          <w:rPr>
+            <w:noProof/>
+            <w:webHidden/>
+          </w:rPr>
+        </w:r>
+        <w:r>
+          <w:rPr>
+            <w:noProof/>
+            <w:webHidden/>
+          </w:rPr>
+          <w:fldChar w:fldCharType="separate"/>
+        </w:r>
+        <w:r>
+          <w:rPr>
+            <w:noProof/>
+            <w:webHidden/>
+          </w:rPr>
+          <w:t>46</w:t>
         </w:r>
         <w:r>
           <w:rPr>
@@ -8130,7 +8276,7 @@
         <w:pStyle w:val="Heading1"/>
         <w:pageBreakBefore w:val="0"/>
       </w:pPr>
-      <w:bookmarkStart w:id="5" w:name="_Toc242421752"/>
+      <w:bookmarkStart w:id="5" w:name="_Toc242423194"/>
       <w:r>
         <w:lastRenderedPageBreak/>
         <w:t>CHƯƠNG 1. GIỚI THIỆU</w:t>
@@ -8141,7 +8287,7 @@
       <w:pPr>
         <w:pStyle w:val="Heading2"/>
       </w:pPr>
-      <w:bookmarkStart w:id="6" w:name="_Toc242421753"/>
+      <w:bookmarkStart w:id="6" w:name="_Toc242423195"/>
       <w:r>
         <w:t>1.1. Đặt vấn đề</w:t>
       </w:r>
@@ -8178,7 +8324,7 @@
       <w:pPr>
         <w:pStyle w:val="Heading2"/>
       </w:pPr>
-      <w:bookmarkStart w:id="7" w:name="_Toc242421754"/>
+      <w:bookmarkStart w:id="7" w:name="_Toc242423196"/>
       <w:r>
         <w:t>1.2. Mục tiêu của đề tài</w:t>
       </w:r>
@@ -8279,7 +8425,7 @@
       <w:pPr>
         <w:pStyle w:val="Heading2"/>
       </w:pPr>
-      <w:bookmarkStart w:id="8" w:name="_Toc242421755"/>
+      <w:bookmarkStart w:id="8" w:name="_Toc242423197"/>
       <w:r>
         <w:lastRenderedPageBreak/>
         <w:t>1.3. Phạm vi nghiên cứu</w:t>
@@ -8314,7 +8460,7 @@
       <w:pPr>
         <w:pStyle w:val="Heading2"/>
       </w:pPr>
-      <w:bookmarkStart w:id="9" w:name="_Toc242421756"/>
+      <w:bookmarkStart w:id="9" w:name="_Toc242423198"/>
       <w:r>
         <w:t>1.4. Cấu trúc báo cáo</w:t>
       </w:r>
@@ -8332,7 +8478,7 @@
       <w:pPr>
         <w:pStyle w:val="Heading2"/>
       </w:pPr>
-      <w:bookmarkStart w:id="10" w:name="_Toc242421757"/>
+      <w:bookmarkStart w:id="10" w:name="_Toc242423199"/>
       <w:r>
         <w:t>1.5. Căn cứ yêu cầu và cách trích dẫn</w:t>
       </w:r>
@@ -8358,7 +8504,7 @@
       <w:pPr>
         <w:pStyle w:val="TableCaption"/>
       </w:pPr>
-      <w:bookmarkStart w:id="11" w:name="_Toc242421833"/>
+      <w:bookmarkStart w:id="11" w:name="_Toc242423276"/>
       <w:r>
         <w:t>Bảng 1-1. Đối chiếu yêu cầu môn học và bằng chứng cần có.</w:t>
       </w:r>
@@ -9164,7 +9310,7 @@
       <w:pPr>
         <w:pStyle w:val="Heading1"/>
       </w:pPr>
-      <w:bookmarkStart w:id="12" w:name="_Toc242421758"/>
+      <w:bookmarkStart w:id="12" w:name="_Toc242423200"/>
       <w:r>
         <w:lastRenderedPageBreak/>
         <w:t>CHƯƠNG 2. CƠ SỞ LÝ THUYẾT</w:t>
@@ -9175,7 +9321,7 @@
       <w:pPr>
         <w:pStyle w:val="Heading2"/>
       </w:pPr>
-      <w:bookmarkStart w:id="13" w:name="_Toc242421759"/>
+      <w:bookmarkStart w:id="13" w:name="_Toc242423201"/>
       <w:r>
         <w:t>2.1. Học máy và xử lý ngôn ngữ trong đề tài</w:t>
       </w:r>
@@ -9209,7 +9355,7 @@
       <w:pPr>
         <w:pStyle w:val="Heading2"/>
       </w:pPr>
-      <w:bookmarkStart w:id="14" w:name="_Toc242421760"/>
+      <w:bookmarkStart w:id="14" w:name="_Toc242423202"/>
       <w:r>
         <w:t>2.2. Định nghĩa bài toán đa nhãn</w:t>
       </w:r>
@@ -9254,7 +9400,7 @@
       <w:pPr>
         <w:pStyle w:val="Heading2"/>
       </w:pPr>
-      <w:bookmarkStart w:id="15" w:name="_Toc242421761"/>
+      <w:bookmarkStart w:id="15" w:name="_Toc242423203"/>
       <w:r>
         <w:t>2.3. TF-IDF và Logistic Regression</w:t>
       </w:r>
@@ -9264,7 +9410,7 @@
       <w:pPr>
         <w:pStyle w:val="Heading3"/>
       </w:pPr>
-      <w:bookmarkStart w:id="16" w:name="_Toc242421762"/>
+      <w:bookmarkStart w:id="16" w:name="_Toc242423204"/>
       <w:r>
         <w:t>2.3.1. TF-IDF</w:t>
       </w:r>
@@ -9340,7 +9486,7 @@
       <w:pPr>
         <w:pStyle w:val="Heading3"/>
       </w:pPr>
-      <w:bookmarkStart w:id="17" w:name="_Toc242421763"/>
+      <w:bookmarkStart w:id="17" w:name="_Toc242423205"/>
       <w:r>
         <w:t>2.3.2. Logistic Regression</w:t>
       </w:r>
@@ -9375,7 +9521,7 @@
       <w:pPr>
         <w:pStyle w:val="Heading3"/>
       </w:pPr>
-      <w:bookmarkStart w:id="18" w:name="_Toc242421764"/>
+      <w:bookmarkStart w:id="18" w:name="_Toc242423206"/>
       <w:r>
         <w:t>2.3.3. One-vs-Rest</w:t>
       </w:r>
@@ -9410,7 +9556,7 @@
       <w:pPr>
         <w:pStyle w:val="Heading2"/>
       </w:pPr>
-      <w:bookmarkStart w:id="19" w:name="_Toc242421765"/>
+      <w:bookmarkStart w:id="19" w:name="_Toc242423207"/>
       <w:r>
         <w:t>2.4. Transformer và ba kiến trúc C</w:t>
       </w:r>
@@ -9456,7 +9602,7 @@
       <w:pPr>
         <w:pStyle w:val="Heading2"/>
       </w:pPr>
-      <w:bookmarkStart w:id="20" w:name="_Toc242421766"/>
+      <w:bookmarkStart w:id="20" w:name="_Toc242423208"/>
       <w:r>
         <w:t>2.5. Zero-shot B và suy luận ngôn ngữ tự nhiên</w:t>
       </w:r>
@@ -9517,7 +9663,7 @@
       <w:pPr>
         <w:pStyle w:val="Heading2"/>
       </w:pPr>
-      <w:bookmarkStart w:id="21" w:name="_Toc242421767"/>
+      <w:bookmarkStart w:id="21" w:name="_Toc242423209"/>
       <w:r>
         <w:t>2.6. Loss nhị phân và mất cân bằng</w:t>
       </w:r>
@@ -9564,7 +9710,7 @@
       <w:pPr>
         <w:pStyle w:val="Heading2"/>
       </w:pPr>
-      <w:bookmarkStart w:id="22" w:name="_Toc242421768"/>
+      <w:bookmarkStart w:id="22" w:name="_Toc242423210"/>
       <w:r>
         <w:t>2.7. Các thước đo đánh giá</w:t>
       </w:r>
@@ -9645,7 +9791,7 @@
       <w:pPr>
         <w:pStyle w:val="Heading2"/>
       </w:pPr>
-      <w:bookmarkStart w:id="23" w:name="_Toc242421769"/>
+      <w:bookmarkStart w:id="23" w:name="_Toc242423211"/>
       <w:r>
         <w:t>2.8. Threshold tuning và nghiên cứu liên quan</w:t>
       </w:r>
@@ -9686,7 +9832,7 @@
       <w:pPr>
         <w:pStyle w:val="Heading1"/>
       </w:pPr>
-      <w:bookmarkStart w:id="24" w:name="_Toc242421770"/>
+      <w:bookmarkStart w:id="24" w:name="_Toc242423212"/>
       <w:r>
         <w:lastRenderedPageBreak/>
         <w:t>CHƯƠNG 3. CHUẨN BỊ DỮ LIỆU</w:t>
@@ -9697,7 +9843,7 @@
       <w:pPr>
         <w:pStyle w:val="Heading2"/>
       </w:pPr>
-      <w:bookmarkStart w:id="25" w:name="_Toc242421771"/>
+      <w:bookmarkStart w:id="25" w:name="_Toc242423213"/>
       <w:r>
         <w:t>3.1. Giới thiệu dữ liệu và khả năng truy xuất</w:t>
       </w:r>
@@ -9751,7 +9897,7 @@
       <w:pPr>
         <w:pStyle w:val="TableCaption"/>
       </w:pPr>
-      <w:bookmarkStart w:id="26" w:name="_Toc242421834"/>
+      <w:bookmarkStart w:id="26" w:name="_Toc242423277"/>
       <w:r>
         <w:t>Bảng 3-1. Số mẫu các split.</w:t>
       </w:r>
@@ -10168,7 +10314,7 @@
           <w:noProof/>
         </w:rPr>
         <w:drawing>
-          <wp:inline distT="0" distB="0" distL="0" distR="0" wp14:anchorId="38817928" wp14:editId="5A11B864">
+          <wp:inline distT="0" distB="0" distL="0" distR="0" wp14:anchorId="1E879AD0" wp14:editId="534AE797">
             <wp:extent cx="5760000" cy="2814731"/>
             <wp:effectExtent l="0" t="0" r="0" b="0"/>
             <wp:docPr id="1" name="Picture 1"/>
@@ -10209,7 +10355,7 @@
         <w:pStyle w:val="FigureCaption"/>
         <w:jc w:val="center"/>
       </w:pPr>
-      <w:bookmarkStart w:id="27" w:name="_Toc242421826"/>
+      <w:bookmarkStart w:id="27" w:name="_Toc242423269"/>
       <w:r>
         <w:t>Hình 3.1. Kích thước bộ chia chính thức; số liệu từ EDA của nhóm.</w:t>
       </w:r>
@@ -10227,7 +10373,7 @@
       <w:pPr>
         <w:pStyle w:val="TableCaption"/>
       </w:pPr>
-      <w:bookmarkStart w:id="28" w:name="_Toc242421835"/>
+      <w:bookmarkStart w:id="28" w:name="_Toc242423278"/>
       <w:r>
         <w:t>Bảng 3-2. Thứ tự nhãn và support train.</w:t>
       </w:r>
@@ -13110,7 +13256,7 @@
       <w:pPr>
         <w:pStyle w:val="Heading2"/>
       </w:pPr>
-      <w:bookmarkStart w:id="29" w:name="_Toc242421772"/>
+      <w:bookmarkStart w:id="29" w:name="_Toc242423214"/>
       <w:r>
         <w:t>3.2. Khám phá dữ liệu</w:t>
       </w:r>
@@ -13120,7 +13266,7 @@
       <w:pPr>
         <w:pStyle w:val="Heading3"/>
       </w:pPr>
-      <w:bookmarkStart w:id="30" w:name="_Toc242421773"/>
+      <w:bookmarkStart w:id="30" w:name="_Toc242423215"/>
       <w:r>
         <w:t>3.2.1. Mất cân bằng và nhãn hiếm</w:t>
       </w:r>
@@ -13156,7 +13302,7 @@
         </w:rPr>
         <w:lastRenderedPageBreak/>
         <w:drawing>
-          <wp:inline distT="0" distB="0" distL="0" distR="0" wp14:anchorId="74DBAB64" wp14:editId="2A4B1E14">
+          <wp:inline distT="0" distB="0" distL="0" distR="0" wp14:anchorId="7BA37760" wp14:editId="492790D1">
             <wp:extent cx="5760000" cy="5225902"/>
             <wp:effectExtent l="0" t="0" r="0" b="0"/>
             <wp:docPr id="2" name="Picture 2"/>
@@ -13197,7 +13343,7 @@
         <w:pStyle w:val="FigureCaption"/>
         <w:jc w:val="center"/>
       </w:pPr>
-      <w:bookmarkStart w:id="31" w:name="_Toc242421827"/>
+      <w:bookmarkStart w:id="31" w:name="_Toc242423270"/>
       <w:r>
         <w:t>Hình 3.2. Phân bố nhãn train; cùng một câu có thể đóng góp nhiều nhãn.</w:t>
       </w:r>
@@ -13207,7 +13353,7 @@
       <w:pPr>
         <w:pStyle w:val="Heading3"/>
       </w:pPr>
-      <w:bookmarkStart w:id="32" w:name="_Toc242421774"/>
+      <w:bookmarkStart w:id="32" w:name="_Toc242423216"/>
       <w:r>
         <w:t>3.2.2. Số nhãn và đồng xuất hiện</w:t>
       </w:r>
@@ -13248,7 +13394,7 @@
         </w:rPr>
         <w:lastRenderedPageBreak/>
         <w:drawing>
-          <wp:inline distT="0" distB="0" distL="0" distR="0" wp14:anchorId="1ECDBDC2" wp14:editId="55F582CF">
+          <wp:inline distT="0" distB="0" distL="0" distR="0" wp14:anchorId="0DEB6DFB" wp14:editId="1BE6F7AC">
             <wp:extent cx="5760000" cy="5176843"/>
             <wp:effectExtent l="0" t="0" r="0" b="0"/>
             <wp:docPr id="3" name="Picture 3"/>
@@ -13289,7 +13435,7 @@
         <w:pStyle w:val="FigureCaption"/>
         <w:jc w:val="center"/>
       </w:pPr>
-      <w:bookmarkStart w:id="33" w:name="_Toc242421828"/>
+      <w:bookmarkStart w:id="33" w:name="_Toc242423271"/>
       <w:r>
         <w:t>Hình 3.3. Đồng xuất hiện annotation train, khác bảng cặp FN/FP ở phần lỗi.</w:t>
       </w:r>
@@ -13299,7 +13445,7 @@
       <w:pPr>
         <w:pStyle w:val="Heading3"/>
       </w:pPr>
-      <w:bookmarkStart w:id="34" w:name="_Toc242421775"/>
+      <w:bookmarkStart w:id="34" w:name="_Toc242423217"/>
       <w:r>
         <w:t>3.2.3. Chất lượng, văn bản trùng và độ dài</w:t>
       </w:r>
@@ -13337,7 +13483,7 @@
       <w:pPr>
         <w:pStyle w:val="Heading2"/>
       </w:pPr>
-      <w:bookmarkStart w:id="35" w:name="_Toc242421776"/>
+      <w:bookmarkStart w:id="35" w:name="_Toc242423218"/>
       <w:r>
         <w:t>3.3. Tiền xử lý và tránh rò rỉ</w:t>
       </w:r>
@@ -13431,7 +13577,7 @@
       <w:pPr>
         <w:pStyle w:val="Heading2"/>
       </w:pPr>
-      <w:bookmarkStart w:id="36" w:name="_Toc242421777"/>
+      <w:bookmarkStart w:id="36" w:name="_Toc242423219"/>
       <w:r>
         <w:t>3.4. Xây dựng đặc trưng và cấu trúc artifacts</w:t>
       </w:r>
@@ -13487,7 +13633,7 @@
       <w:pPr>
         <w:pStyle w:val="Heading2"/>
       </w:pPr>
-      <w:bookmarkStart w:id="37" w:name="_Toc242421778"/>
+      <w:bookmarkStart w:id="37" w:name="_Toc242423220"/>
       <w:r>
         <w:t>3.5. Checklist dữ liệu dùng trước huấn luyện</w:t>
       </w:r>
@@ -14002,7 +14148,7 @@
       <w:pPr>
         <w:pStyle w:val="Heading1"/>
       </w:pPr>
-      <w:bookmarkStart w:id="38" w:name="_Toc242421779"/>
+      <w:bookmarkStart w:id="38" w:name="_Toc242423221"/>
       <w:r>
         <w:lastRenderedPageBreak/>
         <w:t>CHƯƠNG 4. XÂY DỰNG MÔ HÌNH</w:t>
@@ -14013,7 +14159,7 @@
       <w:pPr>
         <w:pStyle w:val="Heading2"/>
       </w:pPr>
-      <w:bookmarkStart w:id="39" w:name="_Toc242421780"/>
+      <w:bookmarkStart w:id="39" w:name="_Toc242423222"/>
       <w:r>
         <w:t>4.1. Kiến trúc hệ thống</w:t>
       </w:r>
@@ -14031,7 +14177,7 @@
       <w:pPr>
         <w:pStyle w:val="TableCaption"/>
       </w:pPr>
-      <w:bookmarkStart w:id="40" w:name="_Toc242421836"/>
+      <w:bookmarkStart w:id="40" w:name="_Toc242423279"/>
       <w:r>
         <w:t>Bảng 4-1. Các hệ thống so sánh.</w:t>
       </w:r>
@@ -14770,7 +14916,7 @@
       <w:pPr>
         <w:pStyle w:val="Heading2"/>
       </w:pPr>
-      <w:bookmarkStart w:id="41" w:name="_Toc242421781"/>
+      <w:bookmarkStart w:id="41" w:name="_Toc242423223"/>
       <w:r>
         <w:t>4.2. Quy trình huấn luyện và suy luận</w:t>
       </w:r>
@@ -14780,7 +14926,7 @@
       <w:pPr>
         <w:pStyle w:val="Heading3"/>
       </w:pPr>
-      <w:bookmarkStart w:id="42" w:name="_Toc242421782"/>
+      <w:bookmarkStart w:id="42" w:name="_Toc242423224"/>
       <w:r>
         <w:t>4.2.1. Baseline A</w:t>
       </w:r>
@@ -14846,7 +14992,7 @@
       <w:pPr>
         <w:pStyle w:val="Heading3"/>
       </w:pPr>
-      <w:bookmarkStart w:id="43" w:name="_Toc242421783"/>
+      <w:bookmarkStart w:id="43" w:name="_Toc242423225"/>
       <w:r>
         <w:t>4.2.2. Zero-shot B</w:t>
       </w:r>
@@ -14872,7 +15018,7 @@
       <w:pPr>
         <w:pStyle w:val="Heading3"/>
       </w:pPr>
-      <w:bookmarkStart w:id="44" w:name="_Toc242421784"/>
+      <w:bookmarkStart w:id="44" w:name="_Toc242423226"/>
       <w:r>
         <w:t>4.2.3. Ba mô hình C và seed</w:t>
       </w:r>
@@ -14935,7 +15081,7 @@
       <w:pPr>
         <w:pStyle w:val="Heading3"/>
       </w:pPr>
-      <w:bookmarkStart w:id="45" w:name="_Toc242421785"/>
+      <w:bookmarkStart w:id="45" w:name="_Toc242423227"/>
       <w:r>
         <w:t>4.2.4. Ngưỡng và nâng cao</w:t>
       </w:r>
@@ -14964,7 +15110,7 @@
       <w:pPr>
         <w:pStyle w:val="Heading2"/>
       </w:pPr>
-      <w:bookmarkStart w:id="46" w:name="_Toc242421786"/>
+      <w:bookmarkStart w:id="46" w:name="_Toc242423228"/>
       <w:r>
         <w:t>4.3. Ví dụ minh họa từng bước</w:t>
       </w:r>
@@ -14974,7 +15120,7 @@
       <w:pPr>
         <w:pStyle w:val="Heading3"/>
       </w:pPr>
-      <w:bookmarkStart w:id="47" w:name="_Toc242421787"/>
+      <w:bookmarkStart w:id="47" w:name="_Toc242423229"/>
       <w:r>
         <w:t>4.3.1. Tạo TF-IDF bằng một tập nhỏ</w:t>
       </w:r>
@@ -15017,7 +15163,7 @@
       <w:pPr>
         <w:pStyle w:val="TableCaption"/>
       </w:pPr>
-      <w:bookmarkStart w:id="48" w:name="_Toc242421837"/>
+      <w:bookmarkStart w:id="48" w:name="_Toc242423280"/>
       <w:r>
         <w:t>Bảng 4-2. Tính LR trên vector minh họa.</w:t>
       </w:r>
@@ -15551,7 +15697,7 @@
       <w:pPr>
         <w:pStyle w:val="Heading3"/>
       </w:pPr>
-      <w:bookmarkStart w:id="49" w:name="_Toc242421788"/>
+      <w:bookmarkStart w:id="49" w:name="_Toc242423230"/>
       <w:r>
         <w:t>4.3.2. Một bước cập nhật để hiểu việc học</w:t>
       </w:r>
@@ -15577,7 +15723,7 @@
       <w:pPr>
         <w:pStyle w:val="Heading3"/>
       </w:pPr>
-      <w:bookmarkStart w:id="50" w:name="_Toc242421789"/>
+      <w:bookmarkStart w:id="50" w:name="_Toc242423231"/>
       <w:r>
         <w:t>4.3.3. Ví dụ tính metric đa nhãn</w:t>
       </w:r>
@@ -15603,7 +15749,7 @@
       <w:pPr>
         <w:pStyle w:val="Heading2"/>
       </w:pPr>
-      <w:bookmarkStart w:id="51" w:name="_Toc242421790"/>
+      <w:bookmarkStart w:id="51" w:name="_Toc242423232"/>
       <w:r>
         <w:t>4.4. Mô hình tự cài đặt</w:t>
       </w:r>
@@ -15641,7 +15787,7 @@
       <w:pPr>
         <w:pStyle w:val="Heading2"/>
       </w:pPr>
-      <w:bookmarkStart w:id="52" w:name="_Toc242421791"/>
+      <w:bookmarkStart w:id="52" w:name="_Toc242423233"/>
       <w:r>
         <w:t>4.5. Mô hình cài đặt bằng thư viện và demo D</w:t>
       </w:r>
@@ -15675,7 +15821,7 @@
       <w:pPr>
         <w:pStyle w:val="Heading1"/>
       </w:pPr>
-      <w:bookmarkStart w:id="53" w:name="_Toc242421792"/>
+      <w:bookmarkStart w:id="53" w:name="_Toc242423234"/>
       <w:r>
         <w:lastRenderedPageBreak/>
         <w:t>CHƯƠNG 5. THỰC NGHIỆM VÀ ĐÁNH GIÁ</w:t>
@@ -15686,7 +15832,7 @@
       <w:pPr>
         <w:pStyle w:val="Heading2"/>
       </w:pPr>
-      <w:bookmarkStart w:id="54" w:name="_Toc242421793"/>
+      <w:bookmarkStart w:id="54" w:name="_Toc242423235"/>
       <w:r>
         <w:t>5.1. Thiết kế thực nghiệm và kết quả A</w:t>
       </w:r>
@@ -15704,7 +15850,7 @@
       <w:pPr>
         <w:pStyle w:val="TableCaption"/>
       </w:pPr>
-      <w:bookmarkStart w:id="55" w:name="_Toc242421838"/>
+      <w:bookmarkStart w:id="55" w:name="_Toc242423281"/>
       <w:r>
         <w:t>Bảng 5-1. Kết quả A trên 5.426 mẫu validation, đủ 28 nhãn.</w:t>
       </w:r>
@@ -16966,7 +17112,7 @@
       <w:pPr>
         <w:pStyle w:val="Heading2"/>
       </w:pPr>
-      <w:bookmarkStart w:id="56" w:name="_Toc242421794"/>
+      <w:bookmarkStart w:id="56" w:name="_Toc242423236"/>
       <w:r>
         <w:lastRenderedPageBreak/>
         <w:t>5.2. Kết quả B, ba C và demo</w:t>
@@ -16977,7 +17123,7 @@
       <w:pPr>
         <w:pStyle w:val="TableCaption"/>
       </w:pPr>
-      <w:bookmarkStart w:id="57" w:name="_Toc242421839"/>
+      <w:bookmarkStart w:id="57" w:name="_Toc242423282"/>
       <w:r>
         <w:t>Bảng 5-2a. Kết quả A/B/C thực tế.</w:t>
       </w:r>
@@ -23225,7 +23371,7 @@
       <w:pPr>
         <w:pStyle w:val="TableCaption"/>
       </w:pPr>
-      <w:bookmarkStart w:id="58" w:name="_Toc242421840"/>
+      <w:bookmarkStart w:id="58" w:name="_Toc242423283"/>
       <w:r>
         <w:t>Bảng 5-2b. Precision/Recall theo cùng split và cấu hình.</w:t>
       </w:r>
@@ -29465,7 +29611,7 @@
       <w:pPr>
         <w:pStyle w:val="Heading3"/>
       </w:pPr>
-      <w:bookmarkStart w:id="59" w:name="_Toc242421795"/>
+      <w:bookmarkStart w:id="59" w:name="_Toc242423237"/>
       <w:r>
         <w:t>5.2.1. Kiểm tra mức hoàn thành</w:t>
       </w:r>
@@ -29486,7 +29632,7 @@
       <w:pPr>
         <w:pStyle w:val="Heading3"/>
       </w:pPr>
-      <w:bookmarkStart w:id="60" w:name="_Toc242421796"/>
+      <w:bookmarkStart w:id="60" w:name="_Toc242423238"/>
       <w:r>
         <w:t>5.2.2. Cấu hình, seed và lựa chọn demo</w:t>
       </w:r>
@@ -29580,7 +29726,7 @@
       <w:pPr>
         <w:pStyle w:val="TableCaption"/>
       </w:pPr>
-      <w:bookmarkStart w:id="61" w:name="_Toc242421841"/>
+      <w:bookmarkStart w:id="61" w:name="_Toc242423284"/>
       <w:r>
         <w:t>Bảng 5-2f. Kết quả từng seed C đã hoàn tất; Macro-F1.</w:t>
       </w:r>
@@ -31076,7 +31222,7 @@
       <w:pPr>
         <w:pStyle w:val="Heading3"/>
       </w:pPr>
-      <w:bookmarkStart w:id="62" w:name="_Toc242421797"/>
+      <w:bookmarkStart w:id="62" w:name="_Toc242423239"/>
       <w:r>
         <w:t>5.2.3. Ba nhóm lỗi C1/C2/C3 trên test</w:t>
       </w:r>
@@ -31094,7 +31240,7 @@
       <w:pPr>
         <w:pStyle w:val="TableCaption"/>
       </w:pPr>
-      <w:bookmarkStart w:id="63" w:name="_Toc242421842"/>
+      <w:bookmarkStart w:id="63" w:name="_Toc242423285"/>
       <w:r>
         <w:t>Bảng 5-2c. So sánh ba nhóm lỗi trên test.</w:t>
       </w:r>
@@ -32715,7 +32861,7 @@
       <w:pPr>
         <w:pStyle w:val="TableCaption"/>
       </w:pPr>
-      <w:bookmarkStart w:id="64" w:name="_Toc242421843"/>
+      <w:bookmarkStart w:id="64" w:name="_Toc242423286"/>
       <w:r>
         <w:t>Bảng 5-2g. Ba C trên cùng ID eczj48j.</w:t>
       </w:r>
@@ -33475,7 +33621,7 @@
       <w:pPr>
         <w:pStyle w:val="TableCaption"/>
       </w:pPr>
-      <w:bookmarkStart w:id="65" w:name="_Toc242421844"/>
+      <w:bookmarkStart w:id="65" w:name="_Toc242423287"/>
       <w:r>
         <w:t>Bảng 5-2h. Ba C trên cùng ID ed0jr9i.</w:t>
       </w:r>
@@ -34226,7 +34372,7 @@
       <w:pPr>
         <w:pStyle w:val="TableCaption"/>
       </w:pPr>
-      <w:bookmarkStart w:id="66" w:name="_Toc242421845"/>
+      <w:bookmarkStart w:id="66" w:name="_Toc242423288"/>
       <w:r>
         <w:t>Bảng 5-2i. Ba C trên cùng ID eczcvgx.</w:t>
       </w:r>
@@ -34971,7 +35117,7 @@
         <w:jc w:val="both"/>
       </w:pPr>
       <w:r>
-        <w:t>Scores là đầu ra sigmoid của các classifier, không phải xác suất đã được kiểm chuẩn. Các quan sát trên không xác lập quan hệ nhân quả. Số lỗi toàn tập xem group_summary.csv; không cộng các nhóm chồng lấp.</w:t>
+        <w:t>Scores là đầu ra sigmoid của các classifier, không phải xác suất đã được kiểm chuẩn. Các quan sát trên không xác lập quan hệ nhân quả. Số lỗi toàn tập xem reports/errors_test_standard_fixed/counts.csv; không cộng các nhóm chồng lấp.</w:t>
       </w:r>
     </w:p>
     <w:p>
@@ -34986,7 +35132,7 @@
       <w:pPr>
         <w:pStyle w:val="Heading3"/>
       </w:pPr>
-      <w:bookmarkStart w:id="67" w:name="_Toc242421798"/>
+      <w:bookmarkStart w:id="67" w:name="_Toc242423240"/>
       <w:r>
         <w:t>5.2.4. Nhãn hiếm và chi phí huấn luyện</w:t>
       </w:r>
@@ -35035,7 +35181,7 @@
       <w:pPr>
         <w:pStyle w:val="TableCaption"/>
       </w:pPr>
-      <w:bookmarkStart w:id="68" w:name="_Toc242421846"/>
+      <w:bookmarkStart w:id="68" w:name="_Toc242423289"/>
       <w:r>
         <w:t>Bảng 5-2d. F1 năm nhãn hiếm trước/sau cải tiến.</w:t>
       </w:r>
@@ -35236,7 +35382,14 @@
                 <w:b/>
                 <w:sz w:val="18"/>
               </w:rPr>
-              <w:t>F1 sau</w:t>
+              <w:t xml:space="preserve">F1 </w:t>
+            </w:r>
+            <w:r>
+              <w:rPr>
+                <w:b/>
+                <w:sz w:val="18"/>
+              </w:rPr>
+              <w:t>sau</w:t>
             </w:r>
           </w:p>
         </w:tc>
@@ -35313,13 +35466,7 @@
               <w:rPr>
                 <w:sz w:val="18"/>
               </w:rPr>
-              <w:t xml:space="preserve">A: </w:t>
-            </w:r>
-            <w:r>
-              <w:rPr>
-                <w:sz w:val="18"/>
-              </w:rPr>
-              <w:t>TF-IDF + LR</w:t>
+              <w:t>A: TF-IDF + LR</w:t>
             </w:r>
           </w:p>
         </w:tc>
@@ -35981,36 +36128,36 @@
               <w:rPr>
                 <w:sz w:val="18"/>
               </w:rPr>
+              <w:t xml:space="preserve">0.0000 ± </w:t>
+            </w:r>
+            <w:r>
+              <w:rPr>
+                <w:sz w:val="18"/>
+              </w:rPr>
+              <w:t>0.0000</w:t>
+            </w:r>
+          </w:p>
+        </w:tc>
+        <w:tc>
+          <w:tcPr>
+            <w:tcW w:w="1296" w:type="dxa"/>
+            <w:tcMar>
+              <w:top w:w="65" w:type="dxa"/>
+              <w:left w:w="65" w:type="dxa"/>
+              <w:bottom w:w="65" w:type="dxa"/>
+              <w:right w:w="65" w:type="dxa"/>
+            </w:tcMar>
+            <w:vAlign w:val="center"/>
+          </w:tcPr>
+          <w:p>
+            <w:pPr>
+              <w:spacing w:before="40" w:after="40" w:line="252" w:lineRule="auto"/>
+            </w:pPr>
+            <w:r>
+              <w:rPr>
+                <w:sz w:val="18"/>
+              </w:rPr>
               <w:t>0.0000 ± 0.0000</w:t>
-            </w:r>
-          </w:p>
-        </w:tc>
-        <w:tc>
-          <w:tcPr>
-            <w:tcW w:w="1296" w:type="dxa"/>
-            <w:tcMar>
-              <w:top w:w="65" w:type="dxa"/>
-              <w:left w:w="65" w:type="dxa"/>
-              <w:bottom w:w="65" w:type="dxa"/>
-              <w:right w:w="65" w:type="dxa"/>
-            </w:tcMar>
-            <w:vAlign w:val="center"/>
-          </w:tcPr>
-          <w:p>
-            <w:pPr>
-              <w:spacing w:before="40" w:after="40" w:line="252" w:lineRule="auto"/>
-            </w:pPr>
-            <w:r>
-              <w:rPr>
-                <w:sz w:val="18"/>
-              </w:rPr>
-              <w:t xml:space="preserve">0.0000 ± </w:t>
-            </w:r>
-            <w:r>
-              <w:rPr>
-                <w:sz w:val="18"/>
-              </w:rPr>
-              <w:t>0.0000</w:t>
             </w:r>
           </w:p>
         </w:tc>
@@ -36656,13 +36803,7 @@
               <w:rPr>
                 <w:sz w:val="18"/>
               </w:rPr>
-              <w:t xml:space="preserve">C3: </w:t>
-            </w:r>
-            <w:r>
-              <w:rPr>
-                <w:sz w:val="18"/>
-              </w:rPr>
-              <w:t>DistilBERT</w:t>
+              <w:t>C3: DistilBERT</w:t>
             </w:r>
           </w:p>
         </w:tc>
@@ -37324,7 +37465,13 @@
               <w:rPr>
                 <w:sz w:val="18"/>
               </w:rPr>
-              <w:t>0.0000 ± 0.0000</w:t>
+              <w:t xml:space="preserve">0.0000 ± </w:t>
+            </w:r>
+            <w:r>
+              <w:rPr>
+                <w:sz w:val="18"/>
+              </w:rPr>
+              <w:t>0.0000</w:t>
             </w:r>
           </w:p>
         </w:tc>
@@ -37940,13 +38087,7 @@
               <w:rPr>
                 <w:sz w:val="18"/>
               </w:rPr>
-              <w:t xml:space="preserve">+0.0139 ± </w:t>
-            </w:r>
-            <w:r>
-              <w:rPr>
-                <w:sz w:val="18"/>
-              </w:rPr>
-              <w:t>0.0773</w:t>
+              <w:t>+0.0139 ± 0.0773</w:t>
             </w:r>
           </w:p>
         </w:tc>
@@ -39149,7 +39290,7 @@
       <w:pPr>
         <w:pStyle w:val="TableCaption"/>
       </w:pPr>
-      <w:bookmarkStart w:id="69" w:name="_Toc242421847"/>
+      <w:bookmarkStart w:id="69" w:name="_Toc242423290"/>
       <w:r>
         <w:lastRenderedPageBreak/>
         <w:t>Bảng 5-2e. Thời gian hoàn thành run C và số tham số.</w:t>
@@ -39810,7 +39951,7 @@
           <w:noProof/>
         </w:rPr>
         <w:drawing>
-          <wp:inline distT="0" distB="0" distL="0" distR="0" wp14:anchorId="46A8160B" wp14:editId="39626B7A">
+          <wp:inline distT="0" distB="0" distL="0" distR="0" wp14:anchorId="06B851E3" wp14:editId="682A211E">
             <wp:extent cx="5760000" cy="1683692"/>
             <wp:effectExtent l="0" t="0" r="0" b="0"/>
             <wp:docPr id="4" name="Picture 4"/>
@@ -39851,7 +39992,7 @@
         <w:pStyle w:val="FigureCaption"/>
         <w:jc w:val="center"/>
       </w:pPr>
-      <w:bookmarkStart w:id="70" w:name="_Toc242421829"/>
+      <w:bookmarkStart w:id="70" w:name="_Toc242423272"/>
       <w:r>
         <w:t xml:space="preserve">Hình 5.1. Đường học validation: mean và sample std theo </w:t>
       </w:r>
@@ -39975,7 +40116,7 @@
         </w:rPr>
         <w:lastRenderedPageBreak/>
         <w:drawing>
-          <wp:inline distT="0" distB="0" distL="0" distR="0" wp14:anchorId="0FC20C1A" wp14:editId="225700B0">
+          <wp:inline distT="0" distB="0" distL="0" distR="0" wp14:anchorId="334569D2" wp14:editId="08F962AD">
             <wp:extent cx="5760000" cy="2304000"/>
             <wp:effectExtent l="0" t="0" r="0" b="0"/>
             <wp:docPr id="5" name="Picture 5"/>
@@ -40016,7 +40157,7 @@
         <w:pStyle w:val="FigureCaption"/>
         <w:jc w:val="center"/>
       </w:pPr>
-      <w:bookmarkStart w:id="71" w:name="_Toc242421830"/>
+      <w:bookmarkStart w:id="71" w:name="_Toc242423273"/>
       <w:r>
         <w:t>Hình 5.2. Macro-F1 ba C: ngưỡng 0,5 và ngưỡng riêng trên validation.</w:t>
       </w:r>
@@ -40043,7 +40184,7 @@
           <w:noProof/>
         </w:rPr>
         <w:drawing>
-          <wp:inline distT="0" distB="0" distL="0" distR="0" wp14:anchorId="7EC21F19" wp14:editId="78300700">
+          <wp:inline distT="0" distB="0" distL="0" distR="0" wp14:anchorId="624B41F7" wp14:editId="7C2E86A1">
             <wp:extent cx="5760000" cy="2304000"/>
             <wp:effectExtent l="0" t="0" r="0" b="0"/>
             <wp:docPr id="6" name="Picture 6"/>
@@ -40084,7 +40225,7 @@
         <w:pStyle w:val="FigureCaption"/>
         <w:jc w:val="center"/>
       </w:pPr>
-      <w:bookmarkStart w:id="72" w:name="_Toc242421831"/>
+      <w:bookmarkStart w:id="72" w:name="_Toc242423274"/>
       <w:r>
         <w:t>Hình 5.3. Macro-F1 ba C: ngưỡng 0,5 và ngưỡng riêng trên test.</w:t>
       </w:r>
@@ -40102,7 +40243,7 @@
       <w:pPr>
         <w:pStyle w:val="Heading3"/>
       </w:pPr>
-      <w:bookmarkStart w:id="73" w:name="_Toc242421799"/>
+      <w:bookmarkStart w:id="73" w:name="_Toc242423241"/>
       <w:r>
         <w:t>5.2.5. Kiểm suy luận và giao diện demo</w:t>
       </w:r>
@@ -40820,7 +40961,7 @@
         </w:rPr>
         <w:lastRenderedPageBreak/>
         <w:drawing>
-          <wp:inline distT="0" distB="0" distL="0" distR="0" wp14:anchorId="65899431" wp14:editId="6A070C1E">
+          <wp:inline distT="0" distB="0" distL="0" distR="0" wp14:anchorId="1FEFCFE4" wp14:editId="4E072BFA">
             <wp:extent cx="5760000" cy="4400000"/>
             <wp:effectExtent l="0" t="0" r="0" b="0"/>
             <wp:docPr id="7" name="Picture 7"/>
@@ -40861,7 +41002,7 @@
         <w:pStyle w:val="FigureCaption"/>
         <w:jc w:val="center"/>
       </w:pPr>
-      <w:bookmarkStart w:id="74" w:name="_Toc242421832"/>
+      <w:bookmarkStart w:id="74" w:name="_Toc242423275"/>
       <w:r>
         <w:t>Hình 5.4. Giao diện demo trên app thật; ảnh khớp SHA-256 trong hồ sơ kiểm UI.</w:t>
       </w:r>
@@ -40879,7 +41020,7 @@
       <w:pPr>
         <w:pStyle w:val="Heading3"/>
       </w:pPr>
-      <w:bookmarkStart w:id="75" w:name="_Toc242421800"/>
+      <w:bookmarkStart w:id="75" w:name="_Toc242423242"/>
       <w:r>
         <w:t>5.2.6. Thứ hạng, độ ổn định và đánh đổi</w:t>
       </w:r>
@@ -40996,7 +41137,7 @@
       <w:pPr>
         <w:pStyle w:val="Heading2"/>
       </w:pPr>
-      <w:bookmarkStart w:id="76" w:name="_Toc242421801"/>
+      <w:bookmarkStart w:id="76" w:name="_Toc242423243"/>
       <w:r>
         <w:t>5.3. Nâng cao và hiệu quả ở nhãn hiếm</w:t>
       </w:r>
@@ -41006,7 +41147,7 @@
       <w:pPr>
         <w:pStyle w:val="TableCaption"/>
       </w:pPr>
-      <w:bookmarkStart w:id="77" w:name="_Toc242421848"/>
+      <w:bookmarkStart w:id="77" w:name="_Toc242423291"/>
       <w:r>
         <w:t>Bảng 5-3. F1 nhãn hiếm của A trên validation; năm nhãn chọn bằng train.</w:t>
       </w:r>
@@ -42072,7 +42213,7 @@
       <w:pPr>
         <w:pStyle w:val="Heading2"/>
       </w:pPr>
-      <w:bookmarkStart w:id="78" w:name="_Toc242421802"/>
+      <w:bookmarkStart w:id="78" w:name="_Toc242423244"/>
       <w:r>
         <w:t>5.4. Phân tích lỗi</w:t>
       </w:r>
@@ -42082,7 +42223,7 @@
       <w:pPr>
         <w:pStyle w:val="Heading3"/>
       </w:pPr>
-      <w:bookmarkStart w:id="79" w:name="_Toc242421803"/>
+      <w:bookmarkStart w:id="79" w:name="_Toc242423245"/>
       <w:r>
         <w:t>5.4.1. Ví dụ lỗi thật của A</w:t>
       </w:r>
@@ -42109,7 +42250,7 @@
       <w:pPr>
         <w:pStyle w:val="TableCaption"/>
       </w:pPr>
-      <w:bookmarkStart w:id="80" w:name="_Toc242421849"/>
+      <w:bookmarkStart w:id="80" w:name="_Toc242423292"/>
       <w:r>
         <w:t>Bảng 5-4. Các nhóm lỗi A có ID và điểm dự đoán.</w:t>
       </w:r>
@@ -42681,7 +42822,7 @@
       <w:pPr>
         <w:pStyle w:val="Heading3"/>
       </w:pPr>
-      <w:bookmarkStart w:id="81" w:name="_Toc242421804"/>
+      <w:bookmarkStart w:id="81" w:name="_Toc242423246"/>
       <w:r>
         <w:t>5.4.2. Cặp nhãn và đối chiếu các C</w:t>
       </w:r>
@@ -42707,7 +42848,7 @@
       <w:pPr>
         <w:pStyle w:val="Heading2"/>
       </w:pPr>
-      <w:bookmarkStart w:id="82" w:name="_Toc242421805"/>
+      <w:bookmarkStart w:id="82" w:name="_Toc242423247"/>
       <w:r>
         <w:t>5.5. Đầu ra giúp gì cho người dùng và cho quá trình cải tiến?</w:t>
       </w:r>
@@ -42736,7 +42877,7 @@
       <w:pPr>
         <w:pStyle w:val="Heading2"/>
       </w:pPr>
-      <w:bookmarkStart w:id="83" w:name="_Toc242421806"/>
+      <w:bookmarkStart w:id="83" w:name="_Toc242423248"/>
       <w:r>
         <w:lastRenderedPageBreak/>
         <w:t>5.6. Giá trị công nghiệp: liên hệ đúng Case Study 4 của Lee (2020)</w:t>
@@ -42747,7 +42888,7 @@
       <w:pPr>
         <w:pStyle w:val="Heading3"/>
       </w:pPr>
-      <w:bookmarkStart w:id="84" w:name="_Toc242421807"/>
+      <w:bookmarkStart w:id="84" w:name="_Toc242423249"/>
       <w:r>
         <w:t>5.6.1. Nội dung trong tài liệu Lee</w:t>
       </w:r>
@@ -42773,7 +42914,7 @@
       <w:pPr>
         <w:pStyle w:val="Heading3"/>
       </w:pPr>
-      <w:bookmarkStart w:id="85" w:name="_Toc242421808"/>
+      <w:bookmarkStart w:id="85" w:name="_Toc242423250"/>
       <w:r>
         <w:t>5.6.2. Liên hệ với đề tài: dữ liệu → dự đoán → quyết định → giá trị</w:t>
       </w:r>
@@ -42791,7 +42932,7 @@
       <w:pPr>
         <w:pStyle w:val="TableCaption"/>
       </w:pPr>
-      <w:bookmarkStart w:id="86" w:name="_Toc242421850"/>
+      <w:bookmarkStart w:id="86" w:name="_Toc242423293"/>
       <w:r>
         <w:t>Bảng 5-5. Quy trình phản hồi khách hàng minh họa; không phải thí nghiệm doanh nghiệp đã đo.</w:t>
       </w:r>
@@ -43303,7 +43444,7 @@
       <w:pPr>
         <w:pStyle w:val="Heading3"/>
       </w:pPr>
-      <w:bookmarkStart w:id="87" w:name="_Toc242421809"/>
+      <w:bookmarkStart w:id="87" w:name="_Toc242423251"/>
       <w:r>
         <w:t>5.6.3. Điều kiện ứng dụng</w:t>
       </w:r>
@@ -43332,7 +43473,7 @@
       <w:pPr>
         <w:pStyle w:val="Heading2"/>
       </w:pPr>
-      <w:bookmarkStart w:id="88" w:name="_Toc242421810"/>
+      <w:bookmarkStart w:id="88" w:name="_Toc242423252"/>
       <w:r>
         <w:t>5.7. Giới hạn của kết luận thực nghiệm</w:t>
       </w:r>
@@ -43358,7 +43499,7 @@
       <w:pPr>
         <w:pStyle w:val="Heading1"/>
       </w:pPr>
-      <w:bookmarkStart w:id="89" w:name="_Toc242421811"/>
+      <w:bookmarkStart w:id="89" w:name="_Toc242423253"/>
       <w:r>
         <w:lastRenderedPageBreak/>
         <w:t>CHƯƠNG 6. KẾT LUẬN VÀ HƯỚNG PHÁT TRIỂN</w:t>
@@ -43369,7 +43510,7 @@
       <w:pPr>
         <w:pStyle w:val="Heading2"/>
       </w:pPr>
-      <w:bookmarkStart w:id="90" w:name="_Toc242421812"/>
+      <w:bookmarkStart w:id="90" w:name="_Toc242423254"/>
       <w:r>
         <w:t>6.1. Kết quả đạt được</w:t>
       </w:r>
@@ -43398,7 +43539,7 @@
       <w:pPr>
         <w:pStyle w:val="Heading2"/>
       </w:pPr>
-      <w:bookmarkStart w:id="91" w:name="_Toc242421813"/>
+      <w:bookmarkStart w:id="91" w:name="_Toc242423255"/>
       <w:r>
         <w:t>6.2. Hạn chế</w:t>
       </w:r>
@@ -43416,7 +43557,7 @@
       <w:pPr>
         <w:pStyle w:val="Heading2"/>
       </w:pPr>
-      <w:bookmarkStart w:id="92" w:name="_Toc242421814"/>
+      <w:bookmarkStart w:id="92" w:name="_Toc242423256"/>
       <w:r>
         <w:t>6.3. Hướng phát triển</w:t>
       </w:r>
@@ -43434,7 +43575,7 @@
       <w:pPr>
         <w:pStyle w:val="Heading1"/>
       </w:pPr>
-      <w:bookmarkStart w:id="93" w:name="_Toc242421815"/>
+      <w:bookmarkStart w:id="93" w:name="_Toc242423257"/>
       <w:r>
         <w:lastRenderedPageBreak/>
         <w:t>TÀI LIỆU THAM KHẢO</w:t>
@@ -44939,7 +45080,7 @@
       <w:pPr>
         <w:pStyle w:val="Heading1"/>
       </w:pPr>
-      <w:bookmarkStart w:id="94" w:name="_Toc242421816"/>
+      <w:bookmarkStart w:id="94" w:name="_Toc242423258"/>
       <w:r>
         <w:lastRenderedPageBreak/>
         <w:t>PHỤ LỤC A. MÃ NGUỒN VÀ HƯỚNG DẪN TÁI HIỆN</w:t>
@@ -44950,7 +45091,7 @@
       <w:pPr>
         <w:pStyle w:val="Heading2"/>
       </w:pPr>
-      <w:bookmarkStart w:id="95" w:name="_Toc242421817"/>
+      <w:bookmarkStart w:id="95" w:name="_Toc242423259"/>
       <w:r>
         <w:t>A.1. Bản đồ mã nguồn</w:t>
       </w:r>
@@ -45909,7 +46050,7 @@
       <w:pPr>
         <w:pStyle w:val="Heading2"/>
       </w:pPr>
-      <w:bookmarkStart w:id="96" w:name="_Toc242421818"/>
+      <w:bookmarkStart w:id="96" w:name="_Toc242423260"/>
       <w:r>
         <w:t>A.2. Giả mã cài đặt LR đa nhãn từ đầu</w:t>
       </w:r>
@@ -46150,7 +46291,7 @@
       <w:pPr>
         <w:pStyle w:val="Heading2"/>
       </w:pPr>
-      <w:bookmarkStart w:id="97" w:name="_Toc242421819"/>
+      <w:bookmarkStart w:id="97" w:name="_Toc242423261"/>
       <w:r>
         <w:t>A.3. Baseline bằng thư viện</w:t>
       </w:r>
@@ -46277,7 +46418,7 @@
       <w:pPr>
         <w:pStyle w:val="Heading2"/>
       </w:pPr>
-      <w:bookmarkStart w:id="98" w:name="_Toc242421820"/>
+      <w:bookmarkStart w:id="98" w:name="_Toc242423262"/>
       <w:r>
         <w:t>A.4. Thứ tự đọc và chạy</w:t>
       </w:r>
@@ -46348,7 +46489,7 @@
       <w:pPr>
         <w:pStyle w:val="Heading2"/>
       </w:pPr>
-      <w:bookmarkStart w:id="99" w:name="_Toc242421821"/>
+      <w:bookmarkStart w:id="99" w:name="_Toc242423263"/>
       <w:r>
         <w:t>A.5. Những nội dung mỗi người cần giải thích khi bảo vệ</w:t>
       </w:r>
@@ -46442,7 +46583,7 @@
       <w:pPr>
         <w:pStyle w:val="Heading1"/>
       </w:pPr>
-      <w:bookmarkStart w:id="100" w:name="_Toc242421822"/>
+      <w:bookmarkStart w:id="100" w:name="_Toc242423264"/>
       <w:r>
         <w:lastRenderedPageBreak/>
         <w:t>PHỤ LỤC B. PHÂN CÔNG VÀ ĐÓNG GÓP</w:t>
@@ -46453,7 +46594,7 @@
       <w:pPr>
         <w:pStyle w:val="Heading2"/>
       </w:pPr>
-      <w:bookmarkStart w:id="101" w:name="_Toc242421823"/>
+      <w:bookmarkStart w:id="101" w:name="_Toc242423265"/>
       <w:r>
         <w:t>B.1. Phân công nhóm bốn người</w:t>
       </w:r>
@@ -46463,7 +46604,7 @@
       <w:pPr>
         <w:pStyle w:val="TableCaption"/>
       </w:pPr>
-      <w:bookmarkStart w:id="102" w:name="_Toc242421851"/>
+      <w:bookmarkStart w:id="102" w:name="_Toc242423294"/>
       <w:r>
         <w:t>Bảng B-1. Trách nhiệm chính và sản phẩm.</w:t>
       </w:r>
@@ -46882,7 +47023,7 @@
       <w:pPr>
         <w:pStyle w:val="Heading2"/>
       </w:pPr>
-      <w:bookmarkStart w:id="103" w:name="_Toc242421824"/>
+      <w:bookmarkStart w:id="103" w:name="_Toc242423266"/>
       <w:r>
         <w:t>B.2. Đóng góp thực tế cần nhóm xác nhận</w:t>
       </w:r>
@@ -47261,13 +47402,13 @@
               <w:rPr>
                 <w:sz w:val="21"/>
               </w:rPr>
-              <w:t xml:space="preserve">Ghi </w:t>
+              <w:t xml:space="preserve">Đã bàn giao </w:t>
             </w:r>
             <w:r>
               <w:rPr>
                 <w:sz w:val="21"/>
               </w:rPr>
-              <w:t>run/artifacts, demo và phần viết thực tế khi bàn giao</w:t>
+              <w:t>code/trainer C3, notebook/HTML, protocol và báo cáo ba seed DistilBERT, phân tích lỗi và demo Streamlit từ kho chung; phạm vi tích hợp được ghi tại B.4</w:t>
             </w:r>
           </w:p>
         </w:tc>
@@ -47306,18 +47447,19 @@
         <w:jc w:val="both"/>
       </w:pPr>
       <w:r>
-        <w:t xml:space="preserve">Bảng phân công mô tả trách nhiệm; bảng đóng góp phải phản ánh công việc đã làm. Nhóm cùng đọc, kiểm bằng artifacts và thống nhất tỷ lệ; không tự chia đều hoặc suy ra tỷ lệ chỉ </w:t>
-      </w:r>
-      <w:r>
-        <w:t>từ số commit. Tài liệu/mã được hỗ trợ bằng công cụ vẫn cần thành viên kiểm tra, học và giải thích trước khi nộp.</w:t>
+        <w:t xml:space="preserve">Bảng phân công mô tả trách nhiệm; bảng đóng góp phải phản ánh công việc đã </w:t>
+      </w:r>
+      <w:r>
+        <w:t>làm. Nhóm cùng đọc, kiểm bằng artifacts và thống nhất tỷ lệ; không tự chia đều hoặc suy ra tỷ lệ chỉ từ số commit. Tài liệu/mã được hỗ trợ bằng công cụ vẫn cần thành viên kiểm tra, học và giải thích trước khi nộp.</w:t>
       </w:r>
     </w:p>
     <w:p>
       <w:pPr>
         <w:pStyle w:val="Heading2"/>
       </w:pPr>
-      <w:bookmarkStart w:id="104" w:name="_Toc242421825"/>
-      <w:r>
+      <w:bookmarkStart w:id="104" w:name="_Toc242423267"/>
+      <w:r>
+        <w:lastRenderedPageBreak/>
         <w:t>B.3. Checklist cuối trước nộp</w:t>
       </w:r>
       <w:bookmarkEnd w:id="104"/>
@@ -47335,7 +47477,6 @@
         <w:pStyle w:val="ListBullet"/>
       </w:pPr>
       <w:r>
-        <w:lastRenderedPageBreak/>
         <w:t>[ ] Ba C mỗi mô hình đủ ≥3 seed full, có từng seed và mean ± std.</w:t>
       </w:r>
     </w:p>
@@ -47403,8 +47544,539 @@
         <w:t>[ ] Nhóm xác nhận đóng góp; mỗi người giải thích được phần phụ trách.</w:t>
       </w:r>
     </w:p>
+    <w:p>
+      <w:pPr>
+        <w:pStyle w:val="Heading2"/>
+      </w:pPr>
+      <w:bookmarkStart w:id="105" w:name="_Toc242423268"/>
+      <w:r>
+        <w:t>B.4. Ghi nhận phần C3 Nhật Huy đã bàn giao và tích hợp</w:t>
+      </w:r>
+      <w:bookmarkEnd w:id="105"/>
+    </w:p>
+    <w:p>
+      <w:pPr>
+        <w:jc w:val="both"/>
+      </w:pPr>
+      <w:r>
+        <w:t xml:space="preserve">Kho chung đã tiếp nhận công việc C3 của Nhật Huy từ snapshot origin/main </w:t>
+      </w:r>
+      <w:r>
+        <w:rPr>
+          <w:rFonts w:ascii="Consolas" w:eastAsia="Consolas" w:hAnsi="Consolas" w:cs="Consolas"/>
+        </w:rPr>
+        <w:t>3acdfc6</w:t>
+      </w:r>
+      <w:r>
+        <w:t xml:space="preserve"> vào ngày 09/10/2026. Đây là nguồn bàn giao của Huy; không ghi toàn bộ phần này thành công của Duy và không tự suy ra phần trăm đóng góp từ số tệp hoặc commit. Hồ sơ tích hợp nằm trong </w:t>
+      </w:r>
+      <w:hyperlink r:id="rId42">
+        <w:r>
+          <w:rPr>
+            <w:color w:val="154B73"/>
+          </w:rPr>
+          <w:t>TICH_HOP_C3_NHAT_HUY.md</w:t>
+        </w:r>
+      </w:hyperlink>
+      <w:r>
+        <w:t>.</w:t>
+      </w:r>
+    </w:p>
+    <w:p>
+      <w:pPr>
+        <w:jc w:val="both"/>
+      </w:pPr>
+      <w:r>
+        <w:t xml:space="preserve">Phần bàn giao gồm </w:t>
+      </w:r>
+      <w:r>
+        <w:rPr>
+          <w:rFonts w:ascii="Consolas" w:eastAsia="Consolas" w:hAnsi="Consolas" w:cs="Consolas"/>
+        </w:rPr>
+        <w:t>src/c3.py</w:t>
+      </w:r>
+      <w:r>
+        <w:t xml:space="preserve">, </w:t>
+      </w:r>
+      <w:r>
+        <w:rPr>
+          <w:rFonts w:ascii="Consolas" w:eastAsia="Consolas" w:hAnsi="Consolas" w:cs="Consolas"/>
+        </w:rPr>
+        <w:t>scripts/train_distilbert.py</w:t>
+      </w:r>
+      <w:r>
+        <w:t xml:space="preserve">, các cấu hình C3, notebook </w:t>
+      </w:r>
+      <w:r>
+        <w:rPr>
+          <w:rFonts w:ascii="Consolas" w:eastAsia="Consolas" w:hAnsi="Consolas" w:cs="Consolas"/>
+        </w:rPr>
+        <w:t>notebooks/distilbert_huy.ipynb</w:t>
+      </w:r>
+      <w:r>
+        <w:t xml:space="preserve"> cùng HTML đã xuất, </w:t>
+      </w:r>
+      <w:r>
+        <w:rPr>
+          <w:rFonts w:ascii="Consolas" w:eastAsia="Consolas" w:hAnsi="Consolas" w:cs="Consolas"/>
+        </w:rPr>
+        <w:t>reports/c3_distilbert/full/C3_RESULTS.md</w:t>
+      </w:r>
+      <w:r>
+        <w:t xml:space="preserve">, protocol/config/môi trường, bảng từng seed/mean/std, ngưỡng riêng, F1 nhãn hiếm và ví dụ lỗi. Hướng dẫn đầy đủ: </w:t>
+      </w:r>
+      <w:hyperlink r:id="rId43">
+        <w:r>
+          <w:rPr>
+            <w:color w:val="154B73"/>
+          </w:rPr>
+          <w:t>HUY_DISTILBERT.md</w:t>
+        </w:r>
+      </w:hyperlink>
+      <w:r>
+        <w:t>. Đây là những artifacts đã có từ nguồn bàn giao; tích hợp mã không có nghĩa là chạy lại các notebook/thí nghiệm lịch sử trên máy hiện tại.</w:t>
+      </w:r>
+    </w:p>
+    <w:p>
+      <w:pPr>
+        <w:pStyle w:val="TableCaption"/>
+      </w:pPr>
+      <w:bookmarkStart w:id="106" w:name="_Toc242423295"/>
+      <w:r>
+        <w:t>Bảng B-2. Hai bộ thực nghiệm DistilBERT được đọc riêng.</w:t>
+      </w:r>
+      <w:bookmarkEnd w:id="106"/>
+    </w:p>
+    <w:tbl>
+      <w:tblPr>
+        <w:tblStyle w:val="TableGrid"/>
+        <w:tblW w:w="0" w:type="auto"/>
+        <w:jc w:val="center"/>
+        <w:tblLayout w:type="fixed"/>
+        <w:tblLook w:val="04A0" w:firstRow="1" w:lastRow="0" w:firstColumn="1" w:lastColumn="0" w:noHBand="0" w:noVBand="1"/>
+      </w:tblPr>
+      <w:tblGrid>
+        <w:gridCol w:w="1861"/>
+        <w:gridCol w:w="2920"/>
+        <w:gridCol w:w="1987"/>
+        <w:gridCol w:w="2920"/>
+      </w:tblGrid>
+      <w:tr>
+        <w:trPr>
+          <w:cantSplit/>
+          <w:tblHeader/>
+          <w:jc w:val="center"/>
+        </w:trPr>
+        <w:tc>
+          <w:tcPr>
+            <w:tcW w:w="1861" w:type="dxa"/>
+            <w:shd w:val="clear" w:color="auto" w:fill="E6EDF3"/>
+            <w:tcMar>
+              <w:top w:w="65" w:type="dxa"/>
+              <w:left w:w="65" w:type="dxa"/>
+              <w:bottom w:w="65" w:type="dxa"/>
+              <w:right w:w="65" w:type="dxa"/>
+            </w:tcMar>
+            <w:vAlign w:val="center"/>
+          </w:tcPr>
+          <w:p>
+            <w:pPr>
+              <w:spacing w:before="40" w:after="40" w:line="252" w:lineRule="auto"/>
+            </w:pPr>
+            <w:r>
+              <w:rPr>
+                <w:b/>
+                <w:sz w:val="21"/>
+              </w:rPr>
+              <w:t>Hồ sơ</w:t>
+            </w:r>
+          </w:p>
+        </w:tc>
+        <w:tc>
+          <w:tcPr>
+            <w:tcW w:w="2920" w:type="dxa"/>
+            <w:shd w:val="clear" w:color="auto" w:fill="E6EDF3"/>
+            <w:tcMar>
+              <w:top w:w="65" w:type="dxa"/>
+              <w:left w:w="65" w:type="dxa"/>
+              <w:bottom w:w="65" w:type="dxa"/>
+              <w:right w:w="65" w:type="dxa"/>
+            </w:tcMar>
+            <w:vAlign w:val="center"/>
+          </w:tcPr>
+          <w:p>
+            <w:pPr>
+              <w:spacing w:before="40" w:after="40" w:line="252" w:lineRule="auto"/>
+            </w:pPr>
+            <w:r>
+              <w:rPr>
+                <w:b/>
+                <w:sz w:val="21"/>
+              </w:rPr>
+              <w:t>Phạm vi</w:t>
+            </w:r>
+          </w:p>
+        </w:tc>
+        <w:tc>
+          <w:tcPr>
+            <w:tcW w:w="1987" w:type="dxa"/>
+            <w:shd w:val="clear" w:color="auto" w:fill="E6EDF3"/>
+            <w:tcMar>
+              <w:top w:w="65" w:type="dxa"/>
+              <w:left w:w="65" w:type="dxa"/>
+              <w:bottom w:w="65" w:type="dxa"/>
+              <w:right w:w="65" w:type="dxa"/>
+            </w:tcMar>
+            <w:vAlign w:val="center"/>
+          </w:tcPr>
+          <w:p>
+            <w:pPr>
+              <w:spacing w:before="40" w:after="40" w:line="252" w:lineRule="auto"/>
+            </w:pPr>
+            <w:r>
+              <w:rPr>
+                <w:b/>
+                <w:sz w:val="21"/>
+              </w:rPr>
+              <w:t>Macro-F1 validation @0,5, mean ± sample std</w:t>
+            </w:r>
+          </w:p>
+        </w:tc>
+        <w:tc>
+          <w:tcPr>
+            <w:tcW w:w="2920" w:type="dxa"/>
+            <w:shd w:val="clear" w:color="auto" w:fill="E6EDF3"/>
+            <w:tcMar>
+              <w:top w:w="65" w:type="dxa"/>
+              <w:left w:w="65" w:type="dxa"/>
+              <w:bottom w:w="65" w:type="dxa"/>
+              <w:right w:w="65" w:type="dxa"/>
+            </w:tcMar>
+            <w:vAlign w:val="center"/>
+          </w:tcPr>
+          <w:p>
+            <w:pPr>
+              <w:spacing w:before="40" w:after="40" w:line="252" w:lineRule="auto"/>
+            </w:pPr>
+            <w:r>
+              <w:rPr>
+                <w:b/>
+                <w:sz w:val="21"/>
+              </w:rPr>
+              <w:t>Cách sử dụng</w:t>
+            </w:r>
+          </w:p>
+        </w:tc>
+      </w:tr>
+      <w:tr>
+        <w:trPr>
+          <w:cantSplit/>
+          <w:jc w:val="center"/>
+        </w:trPr>
+        <w:tc>
+          <w:tcPr>
+            <w:tcW w:w="1861" w:type="dxa"/>
+            <w:tcMar>
+              <w:top w:w="65" w:type="dxa"/>
+              <w:left w:w="65" w:type="dxa"/>
+              <w:bottom w:w="65" w:type="dxa"/>
+              <w:right w:w="65" w:type="dxa"/>
+            </w:tcMar>
+            <w:vAlign w:val="center"/>
+          </w:tcPr>
+          <w:p>
+            <w:pPr>
+              <w:spacing w:before="40" w:after="40" w:line="252" w:lineRule="auto"/>
+            </w:pPr>
+            <w:r>
+              <w:rPr>
+                <w:sz w:val="21"/>
+              </w:rPr>
+              <w:t>C3 trong bộ so sánh chính</w:t>
+            </w:r>
+          </w:p>
+        </w:tc>
+        <w:tc>
+          <w:tcPr>
+            <w:tcW w:w="2920" w:type="dxa"/>
+            <w:tcMar>
+              <w:top w:w="65" w:type="dxa"/>
+              <w:left w:w="65" w:type="dxa"/>
+              <w:bottom w:w="65" w:type="dxa"/>
+              <w:right w:w="65" w:type="dxa"/>
+            </w:tcMar>
+            <w:vAlign w:val="center"/>
+          </w:tcPr>
+          <w:p>
+            <w:pPr>
+              <w:spacing w:before="40" w:after="40" w:line="252" w:lineRule="auto"/>
+            </w:pPr>
+            <w:r>
+              <w:rPr>
+                <w:sz w:val="21"/>
+              </w:rPr>
+              <w:t>Ba seed 42, 123, 2026; cùng module A/B/C, protocol khóa trước test</w:t>
+            </w:r>
+          </w:p>
+        </w:tc>
+        <w:tc>
+          <w:tcPr>
+            <w:tcW w:w="1987" w:type="dxa"/>
+            <w:tcMar>
+              <w:top w:w="65" w:type="dxa"/>
+              <w:left w:w="65" w:type="dxa"/>
+              <w:bottom w:w="65" w:type="dxa"/>
+              <w:right w:w="65" w:type="dxa"/>
+            </w:tcMar>
+            <w:vAlign w:val="center"/>
+          </w:tcPr>
+          <w:p>
+            <w:pPr>
+              <w:spacing w:before="40" w:after="40" w:line="252" w:lineRule="auto"/>
+            </w:pPr>
+            <w:r>
+              <w:rPr>
+                <w:sz w:val="21"/>
+              </w:rPr>
+              <w:t>0.4064 ± 0.0060</w:t>
+            </w:r>
+          </w:p>
+        </w:tc>
+        <w:tc>
+          <w:tcPr>
+            <w:tcW w:w="2920" w:type="dxa"/>
+            <w:tcMar>
+              <w:top w:w="65" w:type="dxa"/>
+              <w:left w:w="65" w:type="dxa"/>
+              <w:bottom w:w="65" w:type="dxa"/>
+              <w:right w:w="65" w:type="dxa"/>
+            </w:tcMar>
+            <w:vAlign w:val="center"/>
+          </w:tcPr>
+          <w:p>
+            <w:pPr>
+              <w:spacing w:before="40" w:after="40" w:line="252" w:lineRule="auto"/>
+            </w:pPr>
+            <w:r>
+              <w:rPr>
+                <w:sz w:val="21"/>
+              </w:rPr>
+              <w:t>Đi vào các bảng so sánh chính, cùng kết quả test đã khóa</w:t>
+            </w:r>
+          </w:p>
+        </w:tc>
+      </w:tr>
+      <w:tr>
+        <w:trPr>
+          <w:cantSplit/>
+          <w:jc w:val="center"/>
+        </w:trPr>
+        <w:tc>
+          <w:tcPr>
+            <w:tcW w:w="1861" w:type="dxa"/>
+            <w:tcMar>
+              <w:top w:w="65" w:type="dxa"/>
+              <w:left w:w="65" w:type="dxa"/>
+              <w:bottom w:w="65" w:type="dxa"/>
+              <w:right w:w="65" w:type="dxa"/>
+            </w:tcMar>
+            <w:vAlign w:val="center"/>
+          </w:tcPr>
+          <w:p>
+            <w:pPr>
+              <w:spacing w:before="40" w:after="40" w:line="252" w:lineRule="auto"/>
+            </w:pPr>
+            <w:r>
+              <w:rPr>
+                <w:sz w:val="21"/>
+              </w:rPr>
+              <w:t>C3 Nhật Huy, snapshot nguồn bàn giao</w:t>
+            </w:r>
+          </w:p>
+        </w:tc>
+        <w:tc>
+          <w:tcPr>
+            <w:tcW w:w="2920" w:type="dxa"/>
+            <w:tcMar>
+              <w:top w:w="65" w:type="dxa"/>
+              <w:left w:w="65" w:type="dxa"/>
+              <w:bottom w:w="65" w:type="dxa"/>
+              <w:right w:w="65" w:type="dxa"/>
+            </w:tcMar>
+            <w:vAlign w:val="center"/>
+          </w:tcPr>
+          <w:p>
+            <w:pPr>
+              <w:spacing w:before="40" w:after="40" w:line="252" w:lineRule="auto"/>
+            </w:pPr>
+            <w:r>
+              <w:rPr>
+                <w:sz w:val="21"/>
+              </w:rPr>
+              <w:t xml:space="preserve">Ba seed 42, 123, 2026; </w:t>
+            </w:r>
+            <w:r>
+              <w:rPr>
+                <w:sz w:val="21"/>
+              </w:rPr>
+              <w:t>trainer/protocol và môi trường riêng; không dùng test</w:t>
+            </w:r>
+          </w:p>
+        </w:tc>
+        <w:tc>
+          <w:tcPr>
+            <w:tcW w:w="1987" w:type="dxa"/>
+            <w:tcMar>
+              <w:top w:w="65" w:type="dxa"/>
+              <w:left w:w="65" w:type="dxa"/>
+              <w:bottom w:w="65" w:type="dxa"/>
+              <w:right w:w="65" w:type="dxa"/>
+            </w:tcMar>
+            <w:vAlign w:val="center"/>
+          </w:tcPr>
+          <w:p>
+            <w:pPr>
+              <w:spacing w:before="40" w:after="40" w:line="252" w:lineRule="auto"/>
+            </w:pPr>
+            <w:r>
+              <w:rPr>
+                <w:sz w:val="21"/>
+              </w:rPr>
+              <w:t>0.4061 ± 0.0045</w:t>
+            </w:r>
+          </w:p>
+        </w:tc>
+        <w:tc>
+          <w:tcPr>
+            <w:tcW w:w="2920" w:type="dxa"/>
+            <w:tcMar>
+              <w:top w:w="65" w:type="dxa"/>
+              <w:left w:w="65" w:type="dxa"/>
+              <w:bottom w:w="65" w:type="dxa"/>
+              <w:right w:w="65" w:type="dxa"/>
+            </w:tcMar>
+            <w:vAlign w:val="center"/>
+          </w:tcPr>
+          <w:p>
+            <w:pPr>
+              <w:spacing w:before="40" w:after="40" w:line="252" w:lineRule="auto"/>
+            </w:pPr>
+            <w:r>
+              <w:rPr>
+                <w:sz w:val="21"/>
+              </w:rPr>
+              <w:t>Ghi nhận kết quả validation và sản phẩm riêng của Huy; không thay điểm test/chọn C thắng</w:t>
+            </w:r>
+          </w:p>
+        </w:tc>
+      </w:tr>
+    </w:tbl>
+    <w:p>
+      <w:pPr>
+        <w:spacing w:after="40"/>
+      </w:pPr>
+    </w:p>
+    <w:p>
+      <w:pPr>
+        <w:jc w:val="both"/>
+      </w:pPr>
+      <w:r>
+        <w:t xml:space="preserve">Nguồn hàng thứ hai là </w:t>
+      </w:r>
+      <w:r>
+        <w:rPr>
+          <w:rFonts w:ascii="Consolas" w:eastAsia="Consolas" w:hAnsi="Consolas" w:cs="Consolas"/>
+        </w:rPr>
+        <w:t>reports/c3_distilbert/full/C3_RESULTS.md</w:t>
+      </w:r>
+      <w:r>
+        <w:t xml:space="preserve">: số chưa làm tròn Macro-F1 0.406084 ± 0.004544. Trainer của Huy dùng gradient checkpointing trên RTX 3050 </w:t>
+      </w:r>
+      <w:r>
+        <w:lastRenderedPageBreak/>
+        <w:t xml:space="preserve">Laptop 4 GB, Python 3.12.6 và PyTorch 2.11.0+cu128; bộ so sánh chính dùng môi trường được ghi trong metadata A/B/C, trong đó C chạy trên RTX 5060 Laptop với PyTorch 2.13.0+cu130. Cùng checkpoint/revision, taxonomy và ba epoch không làm hai bộ trở thành cùng một lượt huấn luyện. Chưa tách ảnh hưởng của trainer, môi trường và gradient checkpointing bằng thí nghiệm </w:t>
+      </w:r>
+      <w:r>
+        <w:t>đối chứng; không quy chênh lệch điểm cho riêng một yếu tố.</w:t>
+      </w:r>
+    </w:p>
+    <w:p>
+      <w:pPr>
+        <w:jc w:val="both"/>
+      </w:pPr>
+      <w:r>
+        <w:t>Không cộng hai bộ thành sáu seed, không gộp mean/std và không đổi điểm validation của Huy thành test. Những kết quả tuned-validation của Huy được đọc với giới hạn calibration trên cùng tập chọn ngưỡng. Nhánh C3 này không làm thay đổi quy tắc chọn kiến trúc của bộ chính: BERT thắng theo mean Macro-F1 validation @0,5; demo D dùng checkpoint BERT seed 123.</w:t>
+      </w:r>
+    </w:p>
+    <w:p>
+      <w:pPr>
+        <w:jc w:val="both"/>
+      </w:pPr>
+      <w:r>
+        <w:rPr>
+          <w:rFonts w:ascii="Consolas" w:eastAsia="Consolas" w:hAnsi="Consolas" w:cs="Consolas"/>
+        </w:rPr>
+        <w:t>app.py</w:t>
+      </w:r>
+      <w:r>
+        <w:t xml:space="preserve"> tiếp tục là demo Gradio của C thắng trong bộ chính, với hồ sơ kiểm suy luận và UI đã nêu tại chương 5. Demo Streamlit của Huy được giữ riêng dưới tên </w:t>
+      </w:r>
+      <w:r>
+        <w:rPr>
+          <w:rFonts w:ascii="Consolas" w:eastAsia="Consolas" w:hAnsi="Consolas" w:cs="Consolas"/>
+        </w:rPr>
+        <w:t>app_distilbert_huy.py</w:t>
+      </w:r>
+      <w:r>
+        <w:t xml:space="preserve">; notebook/HTML/log lịch sử có thể còn ghi tên cũ </w:t>
+      </w:r>
+      <w:r>
+        <w:rPr>
+          <w:rFonts w:ascii="Consolas" w:eastAsia="Consolas" w:hAnsi="Consolas" w:cs="Consolas"/>
+        </w:rPr>
+        <w:t>app.py</w:t>
+      </w:r>
+      <w:r>
+        <w:t>. Trọng số bundle C3 của Huy không nằm trong Git; cần nhận đúng checkpoint/tokenizer/checksum hoặc tái lập trong môi trường riêng để suy luận. Việc tích hợp không tự xác nhận demo Streamlit đã chạy lại tại máy hiện tại.</w:t>
+      </w:r>
+    </w:p>
+    <w:p>
+      <w:pPr>
+        <w:jc w:val="both"/>
+      </w:pPr>
+      <w:r>
+        <w:t xml:space="preserve">Sau tích hợp, suite kiểm mã toàn kho đạt 77/77 tests, thời gian ghi trong log 12,936 giây; nguồn </w:t>
+      </w:r>
+      <w:r>
+        <w:rPr>
+          <w:rFonts w:ascii="Consolas" w:eastAsia="Consolas" w:hAnsi="Consolas" w:cs="Consolas"/>
+        </w:rPr>
+        <w:t>reports/verification_project.json</w:t>
+      </w:r>
+      <w:r>
+        <w:t xml:space="preserve">, mục </w:t>
+      </w:r>
+      <w:r>
+        <w:rPr>
+          <w:rFonts w:ascii="Consolas" w:eastAsia="Consolas" w:hAnsi="Consolas" w:cs="Consolas"/>
+        </w:rPr>
+        <w:t>post_merge_unit_tests</w:t>
+      </w:r>
+      <w:r>
+        <w:t xml:space="preserve">, và </w:t>
+      </w:r>
+      <w:r>
+        <w:rPr>
+          <w:rFonts w:ascii="Consolas" w:eastAsia="Consolas" w:hAnsi="Consolas" w:cs="Consolas"/>
+        </w:rPr>
+        <w:t>reports/execution/unit_tests_post_merge.log</w:t>
+      </w:r>
+      <w:r>
+        <w:t>. Snapshot 69/69 tests trước tích hợp vẫn được giữ như lịch sử; không cộng với 24 tests lịch sử của Huy thành một lượt mới. Kiểm mã không thay các thí nghiệm full hoặc chứng minh chất lượng demo trên dữ liệu mới. Thông tin hành chính và tỷ lệ đóng góp tiếp tục để nhóm xác nhận.</w:t>
+      </w:r>
+    </w:p>
     <w:sectPr>
-      <w:footerReference w:type="default" r:id="rId42"/>
+      <w:footerReference w:type="default" r:id="rId44"/>
       <w:pgSz w:w="12240" w:h="15840"/>
       <w:pgMar w:top="1134" w:right="1134" w:bottom="1134" w:left="1417" w:header="454" w:footer="454" w:gutter="0"/>
       <w:pgNumType w:start="1"/>
@@ -47722,31 +48394,31 @@
       </w:rPr>
     </w:lvl>
   </w:abstractNum>
-  <w:num w:numId="1" w16cid:durableId="541484251">
+  <w:num w:numId="1" w16cid:durableId="66653905">
     <w:abstractNumId w:val="8"/>
   </w:num>
-  <w:num w:numId="2" w16cid:durableId="2135098473">
+  <w:num w:numId="2" w16cid:durableId="512110999">
     <w:abstractNumId w:val="6"/>
   </w:num>
-  <w:num w:numId="3" w16cid:durableId="1574076379">
+  <w:num w:numId="3" w16cid:durableId="1765957323">
     <w:abstractNumId w:val="5"/>
   </w:num>
-  <w:num w:numId="4" w16cid:durableId="1288316456">
+  <w:num w:numId="4" w16cid:durableId="1566338497">
     <w:abstractNumId w:val="4"/>
   </w:num>
-  <w:num w:numId="5" w16cid:durableId="1278676398">
+  <w:num w:numId="5" w16cid:durableId="1464927767">
     <w:abstractNumId w:val="7"/>
   </w:num>
-  <w:num w:numId="6" w16cid:durableId="389959424">
+  <w:num w:numId="6" w16cid:durableId="1277442092">
     <w:abstractNumId w:val="3"/>
   </w:num>
-  <w:num w:numId="7" w16cid:durableId="699360728">
+  <w:num w:numId="7" w16cid:durableId="1808283305">
     <w:abstractNumId w:val="2"/>
   </w:num>
-  <w:num w:numId="8" w16cid:durableId="458652138">
+  <w:num w:numId="8" w16cid:durableId="902640964">
     <w:abstractNumId w:val="1"/>
   </w:num>
-  <w:num w:numId="9" w16cid:durableId="1976373943">
+  <w:num w:numId="9" w16cid:durableId="1611738075">
     <w:abstractNumId w:val="0"/>
   </w:num>
 </w:numbering>
@@ -59170,7 +59842,7 @@
     <w:autoRedefine/>
     <w:uiPriority w:val="39"/>
     <w:unhideWhenUsed/>
-    <w:rsid w:val="006547CF"/>
+    <w:rsid w:val="00A9263F"/>
     <w:pPr>
       <w:spacing w:after="100"/>
     </w:pPr>
@@ -59182,7 +59854,7 @@
     <w:autoRedefine/>
     <w:uiPriority w:val="39"/>
     <w:unhideWhenUsed/>
-    <w:rsid w:val="006547CF"/>
+    <w:rsid w:val="00A9263F"/>
     <w:pPr>
       <w:spacing w:after="100"/>
       <w:ind w:left="240"/>
@@ -59195,7 +59867,7 @@
     <w:autoRedefine/>
     <w:uiPriority w:val="39"/>
     <w:unhideWhenUsed/>
-    <w:rsid w:val="006547CF"/>
+    <w:rsid w:val="00A9263F"/>
     <w:pPr>
       <w:spacing w:after="100"/>
       <w:ind w:left="480"/>
@@ -59206,7 +59878,7 @@
     <w:basedOn w:val="DefaultParagraphFont"/>
     <w:uiPriority w:val="99"/>
     <w:unhideWhenUsed/>
-    <w:rsid w:val="006547CF"/>
+    <w:rsid w:val="00A9263F"/>
     <w:rPr>
       <w:color w:val="0000FF" w:themeColor="hyperlink"/>
       <w:u w:val="single"/>

</xml_diff>